<commit_message>
Justify body paragraphs in paper document
Co-Authored-By: Claude Fable 5 <noreply@anthropic.com>
Claude-Session: https://claude.ai/code/session_01XMxbVW1mQoeJZiQuhYdABE
</commit_message>
<xml_diff>
--- a/הקשר בין חשיפה לרשתות חברתיות לבין דימוי גוף - עבודה מסכמת.docx
+++ b/הקשר בין חשיפה לרשתות חברתיות לבין דימוי גוף - עבודה מסכמת.docx
@@ -232,7 +232,7 @@
       <w:pPr>
         <w:bidi/>
         <w:spacing w:after="0" w:line="480"/>
-        <w:jc w:val="right"/>
+        <w:jc w:val="both"/>
       </w:pPr>
       <w:r>
         <w:rPr>
@@ -248,7 +248,7 @@
       <w:pPr>
         <w:bidi/>
         <w:spacing w:after="0" w:line="480"/>
-        <w:jc w:val="right"/>
+        <w:jc w:val="both"/>
       </w:pPr>
       <w:r>
         <w:rPr>
@@ -298,7 +298,7 @@
       <w:pPr>
         <w:bidi/>
         <w:spacing w:after="0" w:line="480"/>
-        <w:jc w:val="right"/>
+        <w:jc w:val="both"/>
       </w:pPr>
       <w:r>
         <w:rPr>
@@ -337,7 +337,7 @@
       <w:pPr>
         <w:bidi/>
         <w:spacing w:after="0" w:line="480"/>
-        <w:jc w:val="right"/>
+        <w:jc w:val="both"/>
       </w:pPr>
       <w:r>
         <w:rPr>
@@ -353,7 +353,7 @@
       <w:pPr>
         <w:bidi/>
         <w:spacing w:after="0" w:line="480"/>
-        <w:jc w:val="right"/>
+        <w:jc w:val="both"/>
       </w:pPr>
       <w:r>
         <w:rPr>
@@ -386,7 +386,7 @@
       <w:pPr>
         <w:bidi/>
         <w:spacing w:after="0" w:line="480"/>
-        <w:jc w:val="right"/>
+        <w:jc w:val="both"/>
       </w:pPr>
       <w:r>
         <w:rPr>
@@ -436,7 +436,7 @@
       <w:pPr>
         <w:bidi/>
         <w:spacing w:after="0" w:line="480"/>
-        <w:jc w:val="right"/>
+        <w:jc w:val="both"/>
       </w:pPr>
       <w:r>
         <w:rPr>
@@ -475,7 +475,7 @@
       <w:pPr>
         <w:bidi/>
         <w:spacing w:after="0" w:line="480"/>
-        <w:jc w:val="right"/>
+        <w:jc w:val="both"/>
       </w:pPr>
       <w:r>
         <w:rPr>
@@ -491,7 +491,7 @@
       <w:pPr>
         <w:bidi/>
         <w:spacing w:after="0" w:line="480"/>
-        <w:jc w:val="right"/>
+        <w:jc w:val="both"/>
       </w:pPr>
       <w:r>
         <w:rPr>
@@ -507,7 +507,7 @@
       <w:pPr>
         <w:bidi/>
         <w:spacing w:after="0" w:line="480"/>
-        <w:jc w:val="right"/>
+        <w:jc w:val="both"/>
       </w:pPr>
       <w:r>
         <w:rPr>
@@ -546,7 +546,7 @@
       <w:pPr>
         <w:bidi/>
         <w:spacing w:after="0" w:line="480"/>
-        <w:jc w:val="right"/>
+        <w:jc w:val="both"/>
       </w:pPr>
       <w:r>
         <w:rPr>
@@ -562,7 +562,7 @@
       <w:pPr>
         <w:bidi/>
         <w:spacing w:after="0" w:line="480"/>
-        <w:jc w:val="right"/>
+        <w:jc w:val="both"/>
       </w:pPr>
       <w:r>
         <w:rPr>
@@ -578,7 +578,7 @@
       <w:pPr>
         <w:bidi/>
         <w:spacing w:after="0" w:line="480"/>
-        <w:jc w:val="right"/>
+        <w:jc w:val="both"/>
       </w:pPr>
       <w:r>
         <w:rPr>
@@ -634,7 +634,7 @@
       <w:pPr>
         <w:bidi/>
         <w:spacing w:after="0" w:line="480"/>
-        <w:jc w:val="right"/>
+        <w:jc w:val="both"/>
       </w:pPr>
       <w:r>
         <w:rPr>
@@ -667,7 +667,7 @@
       <w:pPr>
         <w:bidi/>
         <w:spacing w:after="0" w:line="480"/>
-        <w:jc w:val="right"/>
+        <w:jc w:val="both"/>
       </w:pPr>
       <w:r>
         <w:rPr>
@@ -700,7 +700,7 @@
       <w:pPr>
         <w:bidi/>
         <w:spacing w:after="0" w:line="480"/>
-        <w:jc w:val="right"/>
+        <w:jc w:val="both"/>
       </w:pPr>
       <w:r>
         <w:rPr>
@@ -716,7 +716,7 @@
       <w:pPr>
         <w:bidi/>
         <w:spacing w:after="0" w:line="480"/>
-        <w:jc w:val="right"/>
+        <w:jc w:val="both"/>
       </w:pPr>
       <w:r>
         <w:rPr>
@@ -772,7 +772,7 @@
       <w:pPr>
         <w:bidi/>
         <w:spacing w:after="0" w:line="480"/>
-        <w:jc w:val="right"/>
+        <w:jc w:val="both"/>
       </w:pPr>
       <w:r>
         <w:rPr>
@@ -788,7 +788,7 @@
       <w:pPr>
         <w:bidi/>
         <w:spacing w:after="0" w:line="480"/>
-        <w:jc w:val="right"/>
+        <w:jc w:val="both"/>
       </w:pPr>
       <w:r>
         <w:rPr>
@@ -821,7 +821,7 @@
       <w:pPr>
         <w:bidi/>
         <w:spacing w:after="0" w:line="480"/>
-        <w:jc w:val="right"/>
+        <w:jc w:val="both"/>
       </w:pPr>
       <w:r>
         <w:rPr>
@@ -877,7 +877,7 @@
       <w:pPr>
         <w:bidi/>
         <w:spacing w:after="0" w:line="480"/>
-        <w:jc w:val="right"/>
+        <w:jc w:val="both"/>
       </w:pPr>
       <w:r>
         <w:rPr>
@@ -910,7 +910,7 @@
       <w:pPr>
         <w:bidi/>
         <w:spacing w:after="0" w:line="480"/>
-        <w:jc w:val="right"/>
+        <w:jc w:val="both"/>
       </w:pPr>
       <w:r>
         <w:rPr>
@@ -950,7 +950,7 @@
         <w:bidi/>
         <w:spacing w:after="120" w:line="480"/>
         <w:ind w:start="709" w:hanging="709"/>
-        <w:jc w:val="right"/>
+        <w:jc w:val="both"/>
       </w:pPr>
       <w:r>
         <w:rPr>
@@ -987,7 +987,7 @@
         <w:bidi/>
         <w:spacing w:after="120" w:line="480"/>
         <w:ind w:start="709" w:hanging="709"/>
-        <w:jc w:val="right"/>
+        <w:jc w:val="both"/>
       </w:pPr>
       <w:r>
         <w:rPr>
@@ -1024,7 +1024,7 @@
         <w:bidi/>
         <w:spacing w:after="120" w:line="480"/>
         <w:ind w:start="709" w:hanging="709"/>
-        <w:jc w:val="right"/>
+        <w:jc w:val="both"/>
       </w:pPr>
       <w:r>
         <w:rPr>

</xml_diff>

<commit_message>
Apply class notes: chapter template, 1.5 spacing, paragraph indent
Co-Authored-By: Claude Fable 5 <noreply@anthropic.com>
Claude-Session: https://claude.ai/code/session_01XMxbVW1mQoeJZiQuhYdABE
</commit_message>
<xml_diff>
--- a/הקשר בין חשיפה לרשתות חברתיות לבין דימוי גוף - עבודה מסכמת.docx
+++ b/הקשר בין חשיפה לרשתות חברתיות לבין דימוי גוף - עבודה מסכמת.docx
@@ -213,7 +213,7 @@
     <w:p>
       <w:pPr>
         <w:bidi/>
-        <w:spacing w:after="120" w:before="0" w:line="480"/>
+        <w:spacing w:after="120" w:before="0" w:line="360"/>
         <w:jc w:val="right"/>
       </w:pPr>
       <w:r>
@@ -231,7 +231,8 @@
     <w:p>
       <w:pPr>
         <w:bidi/>
-        <w:spacing w:after="0" w:line="480"/>
+        <w:spacing w:after="0" w:line="360"/>
+        <w:ind w:firstLine="709"/>
         <w:jc w:val="both"/>
       </w:pPr>
       <w:r>
@@ -247,7 +248,8 @@
     <w:p>
       <w:pPr>
         <w:bidi/>
-        <w:spacing w:after="0" w:line="480"/>
+        <w:spacing w:after="0" w:line="360"/>
+        <w:ind w:firstLine="709"/>
         <w:jc w:val="both"/>
       </w:pPr>
       <w:r>
@@ -297,7 +299,8 @@
     <w:p>
       <w:pPr>
         <w:bidi/>
-        <w:spacing w:after="0" w:line="480"/>
+        <w:spacing w:after="0" w:line="360"/>
+        <w:ind w:firstLine="709"/>
         <w:jc w:val="both"/>
       </w:pPr>
       <w:r>
@@ -318,7 +321,7 @@
     <w:p>
       <w:pPr>
         <w:bidi/>
-        <w:spacing w:after="120" w:before="0" w:line="480"/>
+        <w:spacing w:after="120" w:before="0" w:line="360"/>
         <w:jc w:val="right"/>
       </w:pPr>
       <w:r>
@@ -336,7 +339,8 @@
     <w:p>
       <w:pPr>
         <w:bidi/>
-        <w:spacing w:after="0" w:line="480"/>
+        <w:spacing w:after="0" w:line="360"/>
+        <w:ind w:firstLine="709"/>
         <w:jc w:val="both"/>
       </w:pPr>
       <w:r>
@@ -352,7 +356,8 @@
     <w:p>
       <w:pPr>
         <w:bidi/>
-        <w:spacing w:after="0" w:line="480"/>
+        <w:spacing w:after="0" w:line="360"/>
+        <w:ind w:firstLine="709"/>
         <w:jc w:val="both"/>
       </w:pPr>
       <w:r>
@@ -385,7 +390,8 @@
     <w:p>
       <w:pPr>
         <w:bidi/>
-        <w:spacing w:after="0" w:line="480"/>
+        <w:spacing w:after="0" w:line="360"/>
+        <w:ind w:firstLine="709"/>
         <w:jc w:val="both"/>
       </w:pPr>
       <w:r>
@@ -435,7 +441,8 @@
     <w:p>
       <w:pPr>
         <w:bidi/>
-        <w:spacing w:after="0" w:line="480"/>
+        <w:spacing w:after="0" w:line="360"/>
+        <w:ind w:firstLine="709"/>
         <w:jc w:val="both"/>
       </w:pPr>
       <w:r>
@@ -456,7 +463,7 @@
     <w:p>
       <w:pPr>
         <w:bidi/>
-        <w:spacing w:after="120" w:before="0" w:line="480"/>
+        <w:spacing w:after="120" w:before="0" w:line="360"/>
         <w:jc w:val="right"/>
       </w:pPr>
       <w:r>
@@ -468,13 +475,31 @@
           <w:szCs w:val="28"/>
           <w:rtl/>
         </w:rPr>
-        <w:t xml:space="preserve">פרק 1: מדיה דיגיטליים ורשתות חברתיות בחייהם של צעירים</w:t>
-      </w:r>
-    </w:p>
-    <w:p>
-      <w:pPr>
-        <w:bidi/>
-        <w:spacing w:after="0" w:line="480"/>
+        <w:t xml:space="preserve">פרק 1: מדיה חברתית ורשתות חברתיות: הגדרות כלליות</w:t>
+      </w:r>
+    </w:p>
+    <w:p>
+      <w:pPr>
+        <w:bidi/>
+        <w:spacing w:after="0" w:line="360"/>
+        <w:ind w:firstLine="709"/>
+        <w:jc w:val="both"/>
+      </w:pPr>
+      <w:r>
+        <w:rPr>
+          <w:rFonts w:ascii="David" w:cs="David" w:eastAsia="David" w:hAnsi="David"/>
+          <w:sz w:val="24"/>
+          <w:szCs w:val="24"/>
+          <w:rtl/>
+        </w:rPr>
+        <w:t xml:space="preserve">רשתות חברתיות הן פלטפורמות מקוונות שבהן המשתמש יוצר פרופיל אישי, משתף תמונות, סרטונים וטקסטים ומגיב לתכנים שמעלים אחרים. הן חלק ממערך רחב של מדיה דיגיטליים שהפכו זמינים לילדים ולצעירים בכל שעה ובכל מקום, ושהחשיפה אליהם החלה להיחקר בהרחבה בשני העשורים האחרונים (אליאס, 2022).</w:t>
+      </w:r>
+    </w:p>
+    <w:p>
+      <w:pPr>
+        <w:bidi/>
+        <w:spacing w:after="0" w:line="360"/>
+        <w:ind w:firstLine="709"/>
         <w:jc w:val="both"/>
       </w:pPr>
       <w:r>
@@ -490,7 +515,8 @@
     <w:p>
       <w:pPr>
         <w:bidi/>
-        <w:spacing w:after="0" w:line="480"/>
+        <w:spacing w:after="0" w:line="360"/>
+        <w:ind w:firstLine="709"/>
         <w:jc w:val="both"/>
       </w:pPr>
       <w:r>
@@ -506,7 +532,8 @@
     <w:p>
       <w:pPr>
         <w:bidi/>
-        <w:spacing w:after="0" w:line="480"/>
+        <w:spacing w:after="0" w:line="360"/>
+        <w:ind w:firstLine="709"/>
         <w:jc w:val="both"/>
       </w:pPr>
       <w:r>
@@ -527,7 +554,7 @@
     <w:p>
       <w:pPr>
         <w:bidi/>
-        <w:spacing w:after="120" w:before="0" w:line="480"/>
+        <w:spacing w:after="120" w:before="0" w:line="360"/>
         <w:jc w:val="right"/>
       </w:pPr>
       <w:r>
@@ -539,13 +566,14 @@
           <w:szCs w:val="28"/>
           <w:rtl/>
         </w:rPr>
-        <w:t xml:space="preserve">פרק 2: דימוי גוף וכיצד הוא נבנה</w:t>
-      </w:r>
-    </w:p>
-    <w:p>
-      <w:pPr>
-        <w:bidi/>
-        <w:spacing w:after="0" w:line="480"/>
+        <w:t xml:space="preserve">פרק 2: דימוי גוף: הגדרה ומאפיינים</w:t>
+      </w:r>
+    </w:p>
+    <w:p>
+      <w:pPr>
+        <w:bidi/>
+        <w:spacing w:after="0" w:line="360"/>
+        <w:ind w:firstLine="709"/>
         <w:jc w:val="both"/>
       </w:pPr>
       <w:r>
@@ -561,7 +589,8 @@
     <w:p>
       <w:pPr>
         <w:bidi/>
-        <w:spacing w:after="0" w:line="480"/>
+        <w:spacing w:after="0" w:line="360"/>
+        <w:ind w:firstLine="709"/>
         <w:jc w:val="both"/>
       </w:pPr>
       <w:r>
@@ -577,7 +606,8 @@
     <w:p>
       <w:pPr>
         <w:bidi/>
-        <w:spacing w:after="0" w:line="480"/>
+        <w:spacing w:after="0" w:line="360"/>
+        <w:ind w:firstLine="709"/>
         <w:jc w:val="both"/>
       </w:pPr>
       <w:r>
@@ -615,7 +645,7 @@
     <w:p>
       <w:pPr>
         <w:bidi/>
-        <w:spacing w:after="120" w:before="0" w:line="480"/>
+        <w:spacing w:after="120" w:before="0" w:line="360"/>
         <w:jc w:val="right"/>
       </w:pPr>
       <w:r>
@@ -633,7 +663,8 @@
     <w:p>
       <w:pPr>
         <w:bidi/>
-        <w:spacing w:after="0" w:line="480"/>
+        <w:spacing w:after="0" w:line="360"/>
+        <w:ind w:firstLine="709"/>
         <w:jc w:val="both"/>
       </w:pPr>
       <w:r>
@@ -666,7 +697,8 @@
     <w:p>
       <w:pPr>
         <w:bidi/>
-        <w:spacing w:after="0" w:line="480"/>
+        <w:spacing w:after="0" w:line="360"/>
+        <w:ind w:firstLine="709"/>
         <w:jc w:val="both"/>
       </w:pPr>
       <w:r>
@@ -699,7 +731,8 @@
     <w:p>
       <w:pPr>
         <w:bidi/>
-        <w:spacing w:after="0" w:line="480"/>
+        <w:spacing w:after="0" w:line="360"/>
+        <w:ind w:firstLine="709"/>
         <w:jc w:val="both"/>
       </w:pPr>
       <w:r>
@@ -715,7 +748,8 @@
     <w:p>
       <w:pPr>
         <w:bidi/>
-        <w:spacing w:after="0" w:line="480"/>
+        <w:spacing w:after="0" w:line="360"/>
+        <w:ind w:firstLine="709"/>
         <w:jc w:val="both"/>
       </w:pPr>
       <w:r>
@@ -753,7 +787,7 @@
     <w:p>
       <w:pPr>
         <w:bidi/>
-        <w:spacing w:after="120" w:before="0" w:line="480"/>
+        <w:spacing w:after="120" w:before="0" w:line="360"/>
         <w:jc w:val="right"/>
       </w:pPr>
       <w:r>
@@ -765,13 +799,14 @@
           <w:szCs w:val="28"/>
           <w:rtl/>
         </w:rPr>
-        <w:t xml:space="preserve">פרק 4: גורמים ממתנים והשלכות</w:t>
-      </w:r>
-    </w:p>
-    <w:p>
-      <w:pPr>
-        <w:bidi/>
-        <w:spacing w:after="0" w:line="480"/>
+        <w:t xml:space="preserve">פרק 4: התמודדות עם השפעות החשיפה לרשתות חברתיות</w:t>
+      </w:r>
+    </w:p>
+    <w:p>
+      <w:pPr>
+        <w:bidi/>
+        <w:spacing w:after="0" w:line="360"/>
+        <w:ind w:firstLine="709"/>
         <w:jc w:val="both"/>
       </w:pPr>
       <w:r>
@@ -787,7 +822,8 @@
     <w:p>
       <w:pPr>
         <w:bidi/>
-        <w:spacing w:after="0" w:line="480"/>
+        <w:spacing w:after="0" w:line="360"/>
+        <w:ind w:firstLine="709"/>
         <w:jc w:val="both"/>
       </w:pPr>
       <w:r>
@@ -820,7 +856,8 @@
     <w:p>
       <w:pPr>
         <w:bidi/>
-        <w:spacing w:after="0" w:line="480"/>
+        <w:spacing w:after="0" w:line="360"/>
+        <w:ind w:firstLine="709"/>
         <w:jc w:val="both"/>
       </w:pPr>
       <w:r>
@@ -858,7 +895,7 @@
     <w:p>
       <w:pPr>
         <w:bidi/>
-        <w:spacing w:after="120" w:before="0" w:line="480"/>
+        <w:spacing w:after="120" w:before="0" w:line="360"/>
         <w:jc w:val="right"/>
       </w:pPr>
       <w:r>
@@ -876,7 +913,8 @@
     <w:p>
       <w:pPr>
         <w:bidi/>
-        <w:spacing w:after="0" w:line="480"/>
+        <w:spacing w:after="0" w:line="360"/>
+        <w:ind w:firstLine="709"/>
         <w:jc w:val="both"/>
       </w:pPr>
       <w:r>
@@ -909,7 +947,8 @@
     <w:p>
       <w:pPr>
         <w:bidi/>
-        <w:spacing w:after="0" w:line="480"/>
+        <w:spacing w:after="0" w:line="360"/>
+        <w:ind w:firstLine="709"/>
         <w:jc w:val="both"/>
       </w:pPr>
       <w:r>
@@ -930,7 +969,7 @@
     <w:p>
       <w:pPr>
         <w:bidi/>
-        <w:spacing w:after="120" w:before="0" w:line="480"/>
+        <w:spacing w:after="120" w:before="0" w:line="360"/>
         <w:jc w:val="right"/>
       </w:pPr>
       <w:r>
@@ -948,7 +987,7 @@
     <w:p>
       <w:pPr>
         <w:bidi/>
-        <w:spacing w:after="120" w:line="480"/>
+        <w:spacing w:after="120" w:line="360"/>
         <w:ind w:start="709" w:hanging="709"/>
         <w:jc w:val="both"/>
       </w:pPr>
@@ -985,7 +1024,7 @@
     <w:p>
       <w:pPr>
         <w:bidi/>
-        <w:spacing w:after="120" w:line="480"/>
+        <w:spacing w:after="120" w:line="360"/>
         <w:ind w:start="709" w:hanging="709"/>
         <w:jc w:val="both"/>
       </w:pPr>
@@ -1022,7 +1061,7 @@
     <w:p>
       <w:pPr>
         <w:bidi/>
-        <w:spacing w:after="120" w:line="480"/>
+        <w:spacing w:after="120" w:line="360"/>
         <w:ind w:start="709" w:hanging="709"/>
         <w:jc w:val="both"/>
       </w:pPr>
@@ -1058,7 +1097,7 @@
     </w:p>
     <w:p>
       <w:pPr>
-        <w:spacing w:after="120" w:line="480"/>
+        <w:spacing w:after="120" w:line="360"/>
         <w:ind w:start="709" w:hanging="709"/>
         <w:jc w:val="left"/>
       </w:pPr>
@@ -1091,7 +1130,7 @@
     </w:p>
     <w:p>
       <w:pPr>
-        <w:spacing w:after="120" w:line="480"/>
+        <w:spacing w:after="120" w:line="360"/>
         <w:ind w:start="709" w:hanging="709"/>
         <w:jc w:val="left"/>
       </w:pPr>
@@ -1317,7 +1356,7 @@
     </w:rPrDefault>
     <w:pPrDefault>
       <w:pPr>
-        <w:spacing w:line="480"/>
+        <w:spacing w:line="360"/>
       </w:pPr>
     </w:pPrDefault>
   </w:docDefaults>

</xml_diff>

<commit_message>
Expand all paper sections with detailed findings from source articles
Co-Authored-By: Claude Fable 5 <noreply@anthropic.com>
Claude-Session: https://claude.ai/code/session_01XMxbVW1mQoeJZiQuhYdABE
</commit_message>
<xml_diff>
--- a/הקשר בין חשיפה לרשתות חברתיות לבין דימוי גוף - עבודה מסכמת.docx
+++ b/הקשר בין חשיפה לרשתות חברתיות לבין דימוי גוף - עבודה מסכמת.docx
@@ -242,24 +242,41 @@
           <w:szCs w:val="24"/>
           <w:rtl/>
         </w:rPr>
-        <w:t xml:space="preserve">עבודה זו בוחנת את הקשר שבין חשיפה לרשתות חברתיות לבין דימוי גוף בקרב בוגרים צעירים. העבודה בנויה בשיטת המשפך: היא פותחת במקומם של המדיה הדיגיטליים בחייהם של ילדים וצעירים, ממשיכה אל המושג דימוי גוף ואל הדרך שבה הוא נבנה, מתמקדת בממצאי המחקרים על הקשר בין השניים, וסוגרת בגורמים ממתנים ובהשלכות יישומיות. הסקירה נשענת על חמישה מקורות אקדמיים מהעשור האחרון, שלושה בעברית ושניים באנגלית.</w:t>
-      </w:r>
-    </w:p>
-    <w:p>
-      <w:pPr>
-        <w:bidi/>
-        <w:spacing w:after="0" w:line="360"/>
-        <w:ind w:firstLine="709"/>
-        <w:jc w:val="both"/>
-      </w:pPr>
-      <w:r>
-        <w:rPr>
-          <w:rFonts w:ascii="David" w:cs="David" w:eastAsia="David" w:hAnsi="David"/>
-          <w:sz w:val="24"/>
-          <w:szCs w:val="24"/>
-          <w:rtl/>
-        </w:rPr>
-        <w:t xml:space="preserve">מן הסקירה עולה תמונה מורכבת. מחקר ספרדי בקרב 585 משתמשי אינסטגרם בגילאי 40-18 מצא קשר בין תדירות השימוש לבין חוסר שביעות רצון מהגוף וערך עצמי נמוך, וזיהה את הנטייה להשוות מראה כמנגנון מתווך </w:t>
+        <w:t xml:space="preserve">עבודה זו בוחנת את הקשר שבין חשיפה לרשתות חברתיות לבין דימוי גוף בקרב בוגרים צעירים. הרשתות החברתיות הן חלק משגרת יומם של צעירים בישראל ובעולם, והתכנים המרכזיים בהן הם תמונות: תמונות של חברים ושל המשתמש עצמו, הזוכות לדירוג מיידי בלייקים ובתגובות. מצב זה מעורר את השאלה כיצד קשורה החשיפה המתמדת לתכנים חזותיים אלה לאופן שבו צעירים תופסים את גופם, דווקא בתקופת חיים שבה המראה החיצוני נקשר לזוגיות, לתעסוקה ולערך העצמי.</w:t>
+      </w:r>
+    </w:p>
+    <w:p>
+      <w:pPr>
+        <w:bidi/>
+        <w:spacing w:after="0" w:line="360"/>
+        <w:ind w:firstLine="709"/>
+        <w:jc w:val="both"/>
+      </w:pPr>
+      <w:r>
+        <w:rPr>
+          <w:rFonts w:ascii="David" w:cs="David" w:eastAsia="David" w:hAnsi="David"/>
+          <w:sz w:val="24"/>
+          <w:szCs w:val="24"/>
+          <w:rtl/>
+        </w:rPr>
+        <w:t xml:space="preserve">העבודה בנויה בשיטת המשפך והיא מבוססת על סיכום אינטגרטיבי של חמישה מקורות אקדמיים מהעשור האחרון, שלושה בעברית ושניים באנגלית. הפרק הראשון מגדיר מדיה חברתית ורשתות חברתיות ומתאר את מקומן בחיי צעירים. הפרק השני מגדיר דימוי גוף ומציג את המנגנונים התאורטיים של השוואה חברתית וטיפוח. הפרק השלישי משווה בין ממצאיהם של שלושה מחקרים אמפיריים שנערכו בישראל, בגרמניה ובספרד, והפרק הרביעי עוסק בדרכי התמודדות.</w:t>
+      </w:r>
+    </w:p>
+    <w:p>
+      <w:pPr>
+        <w:bidi/>
+        <w:spacing w:after="0" w:line="360"/>
+        <w:ind w:firstLine="709"/>
+        <w:jc w:val="both"/>
+      </w:pPr>
+      <w:r>
+        <w:rPr>
+          <w:rFonts w:ascii="David" w:cs="David" w:eastAsia="David" w:hAnsi="David"/>
+          <w:sz w:val="24"/>
+          <w:szCs w:val="24"/>
+          <w:rtl/>
+        </w:rPr>
+        <w:t xml:space="preserve">מן ההשוואה עולה תמונה מורכבת. במדגם הספרדי נמצא קשר בין תדירות השימוש באינסטגרם לבין חוסר שביעות רצון מהגוף וערך עצמי נמוך, בתיווך הנטייה להשוות מראה </w:t>
       </w:r>
       <w:r>
         <w:rPr>
@@ -276,7 +293,7 @@
           <w:szCs w:val="24"/>
           <w:rtl/>
         </w:rPr>
-        <w:t xml:space="preserve">. מחקר גרמני בקרב צעירים בגילאי 34-18 הראה שזמן השימוש כשלעצמו אינו מנבא פגיעה, ודווקא הרגלי גלישה בתכנים של זרים ניבאו עמדות נוקשות כלפי מראה ודפוסי אכילה מופרעים </w:t>
+        <w:t xml:space="preserve">. במדגם הגרמני זמן השימוש כשלעצמו לא ניבא דבר, ודווקא גלישה בתכנים של זרים ניבאה עמדות נוקשות כלפי מראה ודפוסי אכילה מופרעים </w:t>
       </w:r>
       <w:r>
         <w:rPr>
@@ -293,24 +310,24 @@
           <w:szCs w:val="24"/>
           <w:rtl/>
         </w:rPr>
-        <w:t xml:space="preserve">. במחקר ישראלי בקרב בוגרים צעירים נמצא, בניגוד להשערה, קשר חיובי מתון בין חשיפה לתמונות בפייסבוק לבין דימוי גוף, וקשר זה נעלם כאשר נכללה במודל אינטליגנציה רגשית (פולישוק וזיסברג, 2016).</w:t>
-      </w:r>
-    </w:p>
-    <w:p>
-      <w:pPr>
-        <w:bidi/>
-        <w:spacing w:after="0" w:line="360"/>
-        <w:ind w:firstLine="709"/>
-        <w:jc w:val="both"/>
-      </w:pPr>
-      <w:r>
-        <w:rPr>
-          <w:rFonts w:ascii="David" w:cs="David" w:eastAsia="David" w:hAnsi="David"/>
-          <w:sz w:val="24"/>
-          <w:szCs w:val="24"/>
-          <w:rtl/>
-        </w:rPr>
-        <w:t xml:space="preserve">המסקנה המרכזית היא שהשאלה אינה כמה זמן צעירים מבלים ברשתות, אלא מה הם עושים שם ובאילו משאבים אישיים הם מצוידים. בסיום העבודה מוצעות המלצות מעשיות: פיתוח אוריינות דיגיטלית, טיפוח מיומנויות רגשיות במסגרות חינוך והכוונה של הרגלי שימוש, לצד הצעות למחקר המשך.</w:t>
+        <w:t xml:space="preserve">. במדגם הישראלי נמצא, בניגוד להשערה, קשר חיובי מתון בין חשיפה לתמונות בפייסבוק לבין דימוי גוף, והקשר נעלם כאשר נכללה במודל אינטליגנציה רגשית (פולישוק וזיסברג, 2016).</w:t>
+      </w:r>
+    </w:p>
+    <w:p>
+      <w:pPr>
+        <w:bidi/>
+        <w:spacing w:after="0" w:line="360"/>
+        <w:ind w:firstLine="709"/>
+        <w:jc w:val="both"/>
+      </w:pPr>
+      <w:r>
+        <w:rPr>
+          <w:rFonts w:ascii="David" w:cs="David" w:eastAsia="David" w:hAnsi="David"/>
+          <w:sz w:val="24"/>
+          <w:szCs w:val="24"/>
+          <w:rtl/>
+        </w:rPr>
+        <w:t xml:space="preserve">המסקנה המרכזית היא שהשאלה אינה כמה זמן צעירים מבלים ברשתות, אלא מה הם עושים שם ובאילו משאבים אישיים הם מצוידים. על בסיס זה מוצעות בסוף העבודה המלצות מעשיות: שילוב אוריינות דיגיטלית העוסקת בדימוי גוף בתוכניות חינוך, טיפוח מיומנויות רגשיות והדרכה לשימוש מודע ברשתות, לצד הצעות למחקר המשך.</w:t>
       </w:r>
     </w:p>
     <w:p>
@@ -350,24 +367,24 @@
           <w:szCs w:val="24"/>
           <w:rtl/>
         </w:rPr>
-        <w:t xml:space="preserve">חקר תפקידם של המדיה בחייהם של ילדים ובני נוער עשה בעשורים האחרונים קפיצת מדרגה, והמעבר לסביבה רוויית טכנולוגיות דיגיטליות הרחיב את מגוון התכנים, דרכי הגישה והפרקטיקות של צריכת תכנים ויצירתם. לתהליכים אלה השלכות על התפתחות קוגניטיבית, רגשית וחברתית, על גיבוש זהות ועל רווחה נפשית (אליאס, 2022).</w:t>
-      </w:r>
-    </w:p>
-    <w:p>
-      <w:pPr>
-        <w:bidi/>
-        <w:spacing w:after="0" w:line="360"/>
-        <w:ind w:firstLine="709"/>
-        <w:jc w:val="both"/>
-      </w:pPr>
-      <w:r>
-        <w:rPr>
-          <w:rFonts w:ascii="David" w:cs="David" w:eastAsia="David" w:hAnsi="David"/>
-          <w:sz w:val="24"/>
-          <w:szCs w:val="24"/>
-          <w:rtl/>
-        </w:rPr>
-        <w:t xml:space="preserve">בתוך התחום הרחב הזה בחרנו להתמקד בזירה אחת: רשתות חברתיות מבוססות תמונה, ובשאלה כיצד החשיפה אליהן קשורה לדימוי הגוף של בוגרים צעירים. גילאי העשרים והשלושים המוקדמים הם קהל היעד העיקרי של פלטפורמות כמו אינסטגרם ופייסבוק, ובה בעת זוהי תקופה שבה המראה החיצוני נקשר לזוגיות, לתעסוקה ולערך העצמי. הספרות מציעה שאידיאלי היופי, שהועברו בעבר דרך טלוויזיה ומגזינים, עוברים כיום בעיקר דרך הרשתות החברתיות </w:t>
+        <w:t xml:space="preserve">חקר תפקידם של המדיה בחייהם של ילדים ובני נוער עשה בעשורים האחרונים קפיצת מדרגה במספר המחקרים, בנושאים הנדונים ובמתודולוגיות. המעבר לסביבה רוויית טכנולוגיות דיגיטליות יצר מגוון גדול יותר של תכנים, דרכי גישה ופרקטיקות של צריכת תכנים ויצירתם, ולתהליכים אלה השלכות על התפתחות קוגניטיבית, רגשית וחברתית, על גיבוש זהות, על יחסים במשפחה ועל רווחה נפשית (אליאס, 2022).</w:t>
+      </w:r>
+    </w:p>
+    <w:p>
+      <w:pPr>
+        <w:bidi/>
+        <w:spacing w:after="0" w:line="360"/>
+        <w:ind w:firstLine="709"/>
+        <w:jc w:val="both"/>
+      </w:pPr>
+      <w:r>
+        <w:rPr>
+          <w:rFonts w:ascii="David" w:cs="David" w:eastAsia="David" w:hAnsi="David"/>
+          <w:sz w:val="24"/>
+          <w:szCs w:val="24"/>
+          <w:rtl/>
+        </w:rPr>
+        <w:t xml:space="preserve">בתוך התחום הרחב הזה בחרנו להתמקד בזירה אחת: רשתות חברתיות מבוססות תמונה, ובשאלה כיצד החשיפה אליהן קשורה לדימוי הגוף של בוגרים צעירים. הבחירה באוכלוסייה זו אינה מקרית. צעירים בגילאי העשרים והשלושים המוקדמים הם קהל היעד העיקרי של פלטפורמות כמו אינסטגרם ופייסבוק, ובה בעת זוהי תקופה של גיבוש זהות, יצירת קשרים זוגיים וכניסה לעולם התעסוקה. הספרות מציעה שאידיאלי היופי, שהועברו בעבר דרך טלוויזיה ומגזינים, עוברים כיום בעיקר דרך הרשתות החברתיות, כך שההשוואה אליהם מלווה את הצעירים לאורך שעות היום </w:t>
       </w:r>
       <w:r>
         <w:rPr>
@@ -401,7 +418,7 @@
           <w:szCs w:val="24"/>
           <w:rtl/>
         </w:rPr>
-        <w:t xml:space="preserve">העבודה מבוססת על סיכום אינטגרטיבי של חמישה מקורות. המאמר המוביל הוא מחקרם של פולישוק וזיסברג (2016), שבחן בקרב בוגרים צעירים בישראל את הקשרים בין אינטליגנציה רגשית, חשיפה לתוכני תמונות בפייסבוק ודימוי גוף. לצדו נסקרים מאמר הפתיחה של אליאס (2022) על ילדות דיגיטלית, מחקרה של יאיר (2025) על שפת בני נוער בווטסאפ, מחקר שיישם את תאוריית הטיפוח על אינסטגרם </w:t>
+        <w:t xml:space="preserve">שאלת העבודה היא אפוא: מה ידוע במחקר על הקשר שבין חשיפה לרשתות חברתיות לבין דימוי גוף בקרב בוגרים צעירים, ומה ניתן ללמוד ממנו על דרכי התמודדות. העבודה מבוססת על סיכום אינטגרטיבי של חמישה מקורות. המאמר המוביל הוא מחקרם של פולישוק וזיסברג (2016), שנערך בקרב בוגרים צעירים בישראל ובחן את הקשרים בין אינטליגנציה רגשית, חשיפה לתוכני תמונות בפייסבוק ודימוי גוף. לצדו נסקרים מאמרה של אליאס (2022) על ילדות דיגיטלית, מחקרה של יאיר (2025) על שפת בני נוער בווטסאפ, מחקר גרמני שיישם את תאוריית הטיפוח על אינסטגרם </w:t>
       </w:r>
       <w:r>
         <w:rPr>
@@ -418,7 +435,7 @@
           <w:szCs w:val="24"/>
           <w:rtl/>
         </w:rPr>
-        <w:t xml:space="preserve"> ומחקר רחב היקף על אינסטגרם, דימוי גוף וערך עצמי </w:t>
+        <w:t xml:space="preserve"> ומחקר ספרדי רחב היקף על אינסטגרם, דימוי גוף וערך עצמי </w:t>
       </w:r>
       <w:r>
         <w:rPr>
@@ -452,7 +469,7 @@
           <w:szCs w:val="24"/>
           <w:rtl/>
         </w:rPr>
-        <w:t xml:space="preserve">מבנה העבודה הולך מן הרחב אל הצר. הפרק הראשון עוסק במקומם של המדיה הדיגיטליים בחיי צעירים. הפרק השני מגדיר דימוי גוף ומציג את המנגנון של השוואה חברתית. הפרק השלישי, לב העבודה, משווה בין ממצאי שלושת המחקרים האמפיריים על הקשר שבין חשיפה לרשתות לבין דימוי גוף. הפרק הרביעי דן בגורמים ממתנים ובהשלכות, ואחריו מובאים סיכום ורשימת מקורות.</w:t>
+        <w:t xml:space="preserve">מבנה העבודה הולך מן הרחב אל הצר, בשיטת המשפך. הפרק הראשון פותח בנושא הכללי: מדיה חברתית ורשתות חברתיות, הגדרתן ומקומן בחיי צעירים. הפרק השני מצטמצם אל המושג דימוי גוף ואל המנגנונים המסבירים כיצד הוא מושפע מן הסביבה. הפרק השלישי, לב העבודה, מגיע אל הנושא הספציפי ומשווה בין ממצאי שלושת המחקרים האמפיריים. הפרק הרביעי דן בדרכי התמודדות, ואחריו מובאים סיכום קצר ורשימת מקורות.</w:t>
       </w:r>
     </w:p>
     <w:p>
@@ -509,41 +526,58 @@
           <w:szCs w:val="24"/>
           <w:rtl/>
         </w:rPr>
-        <w:t xml:space="preserve">הסביבה הדיגיטלית שינתה את חוויית הילדות וההתבגרות. ילדים וצעירים גדלים כיום בסביבה שבה המסך זמין בכל שעה, והמחקר על אודותיהם התרחב במספר המחקרים, בנושאים ובמתודולוגיות. הספרות מתארת גם סיכונים מקוונים וגם תרומה של ממש לרווחתם של ילדים ומשפחות, למשל בתקופת מגפת הקורונה, ומדגישה את הצורך באוריינות דיגיטלית של הורים ושל ילדים כאחד, כדי למצוא איזון בין אורח חיים מקוון ללא מקוון (אליאס, 2022).</w:t>
-      </w:r>
-    </w:p>
-    <w:p>
-      <w:pPr>
-        <w:bidi/>
-        <w:spacing w:after="0" w:line="360"/>
-        <w:ind w:firstLine="709"/>
-        <w:jc w:val="both"/>
-      </w:pPr>
-      <w:r>
-        <w:rPr>
-          <w:rFonts w:ascii="David" w:cs="David" w:eastAsia="David" w:hAnsi="David"/>
-          <w:sz w:val="24"/>
-          <w:szCs w:val="24"/>
-          <w:rtl/>
-        </w:rPr>
-        <w:t xml:space="preserve">הרשתות החברתיות הן מרחב חברתי של ממש, שבו צעירים מנהלים את חיי החברה שלהם בפועל. מחקר שניתח יותר מאלף התכתבויות ווטסאפ של בני נוער בישראל מצא שהם יוצרים בתוכן שפה משלהם: שגיאות כתיב מכוונות, מניפולציות גרפיות והומור משמשים אותם לניהול קשרים חברתיים, להבניית זהות ולהבעת רגשות, ונורמות לשוניות חדשות נוצרות שם כל הזמן (יאיר, 2025).</w:t>
-      </w:r>
-    </w:p>
-    <w:p>
-      <w:pPr>
-        <w:bidi/>
-        <w:spacing w:after="0" w:line="360"/>
-        <w:ind w:firstLine="709"/>
-        <w:jc w:val="both"/>
-      </w:pPr>
-      <w:r>
-        <w:rPr>
-          <w:rFonts w:ascii="David" w:cs="David" w:eastAsia="David" w:hAnsi="David"/>
-          <w:sz w:val="24"/>
-          <w:szCs w:val="24"/>
-          <w:rtl/>
-        </w:rPr>
-        <w:t xml:space="preserve">שני המקורות הללו משרטטים את הרקע לעבודה: אם הרשת היא הזירה שבה צעירים מציגים את עצמם ובוחנים את עצמם מול אחרים, מתבקש לשאול מה קורה שם לאחד הרכיבים הרגישים של העצמי, הוא דימוי הגוף (אליאס, 2022; יאיר, 2025).</w:t>
+        <w:t xml:space="preserve">הסביבה הדיגיטלית שינתה את חוויית הילדות וההתבגרות. הספרות מתארת גם סיכונים מקוונים וגם תרומה של ממש לרווחתם של ילדים ומשפחות, למשל בתקופת מגפת הקורונה, שבה שימשו המדיה הדיגיטליים ערוץ מרכזי ללמידה ולקשר חברתי. על רקע זה מודגש הצורך באוריינות דיגיטלית של הורים ושל ילדים כאחד, שתאפשר מודעות לסיכונים ומציאת איזון בין אורח חיים מקוון ללא מקוון (אליאס, 2022).</w:t>
+      </w:r>
+    </w:p>
+    <w:p>
+      <w:pPr>
+        <w:bidi/>
+        <w:spacing w:after="0" w:line="360"/>
+        <w:ind w:firstLine="709"/>
+        <w:jc w:val="both"/>
+      </w:pPr>
+      <w:r>
+        <w:rPr>
+          <w:rFonts w:ascii="David" w:cs="David" w:eastAsia="David" w:hAnsi="David"/>
+          <w:sz w:val="24"/>
+          <w:szCs w:val="24"/>
+          <w:rtl/>
+        </w:rPr>
+        <w:t xml:space="preserve">מה שמייחד את הרשתות החברתיות לעומת המדיה המסורתית הוא אופי התוכן והמשוב עליו. הצפייה אינה עוד צפייה פסיבית בתמונות של מפורסמים או דוגמנים: המשתמשים מעלים תמונות של עצמם ושל חבריהם, ואלה נצפות ומדורגות מיידית בלייקים ובתגובות מילוליות לעיני משתמשים רבים. בדיקת הפרופיל היא חלק בלתי נפרד משגרת היום של צעירים בישראל ובעולם, והיא חושפת אותם שוב ושוב לדירוג תמונותיהם ותמונות חבריהם (פולישוק וזיסברג, 2016).</w:t>
+      </w:r>
+    </w:p>
+    <w:p>
+      <w:pPr>
+        <w:bidi/>
+        <w:spacing w:after="0" w:line="360"/>
+        <w:ind w:firstLine="709"/>
+        <w:jc w:val="both"/>
+      </w:pPr>
+      <w:r>
+        <w:rPr>
+          <w:rFonts w:ascii="David" w:cs="David" w:eastAsia="David" w:hAnsi="David"/>
+          <w:sz w:val="24"/>
+          <w:szCs w:val="24"/>
+          <w:rtl/>
+        </w:rPr>
+        <w:t xml:space="preserve">הרשתות הן גם מרחב שבו צעירים יוצרים תרבות משלהם. מחקר נטנוגרפי שניתח 1,150 תשדורות ווטסאפ של בני נוער בישראל, לצד ראיונות עם שנים עשר מהם, מצא שהם מפתחים בתוך הפלטפורמה שפה ייחודית: שגיאות כתיב מכוונות, מניפולציות גרפיות על הטקסט והומור משמשים אותם לניהול קשרים חברתיים, להבניית זהות ולהבעת רגשות, ונורמות לשוניות חדשות נוצרות שם כל הזמן. הרשת מתפקדת עבורם כמרחב חברתי דינמי שבו הם חיים ממש (יאיר, 2025).</w:t>
+      </w:r>
+    </w:p>
+    <w:p>
+      <w:pPr>
+        <w:bidi/>
+        <w:spacing w:after="0" w:line="360"/>
+        <w:ind w:firstLine="709"/>
+        <w:jc w:val="both"/>
+      </w:pPr>
+      <w:r>
+        <w:rPr>
+          <w:rFonts w:ascii="David" w:cs="David" w:eastAsia="David" w:hAnsi="David"/>
+          <w:sz w:val="24"/>
+          <w:szCs w:val="24"/>
+          <w:rtl/>
+        </w:rPr>
+        <w:t xml:space="preserve">שני המקורות הללו משרטטים את הרקע לעבודה: אם הרשת היא הזירה שבה צעירים מציגים את עצמם, נמדדים ונבחנים מול אחרים, מתבקש לשאול מה קורה שם לאחד הרכיבים הרגישים של העצמי, הוא דימוי הגוף (אליאס, 2022; יאיר, 2025).</w:t>
       </w:r>
     </w:p>
     <w:p>
@@ -583,41 +617,41 @@
           <w:szCs w:val="24"/>
           <w:rtl/>
         </w:rPr>
-        <w:t xml:space="preserve">דימוי גוף הוא האופן שבו אדם תופס, חושב ומרגיש כלפי גופו. הספרות רואה בהיווצרותו תהליך מתמשך, המשלב הערכות קוגניטיביות לא מודעות והשוואה לא מודעת לאחרים, על רקע נורמות והנחות תרבותיות וחברתיות. דימוי גוף ירוד אינו עניין אסתטי בלבד: הוא כרוך במצוקה נפשית ועלול להתבטא גם בדפוסי אכילה בלתי מסתגלים (פולישוק וזיסברג, 2016).</w:t>
-      </w:r>
-    </w:p>
-    <w:p>
-      <w:pPr>
-        <w:bidi/>
-        <w:spacing w:after="0" w:line="360"/>
-        <w:ind w:firstLine="709"/>
-        <w:jc w:val="both"/>
-      </w:pPr>
-      <w:r>
-        <w:rPr>
-          <w:rFonts w:ascii="David" w:cs="David" w:eastAsia="David" w:hAnsi="David"/>
-          <w:sz w:val="24"/>
-          <w:szCs w:val="24"/>
-          <w:rtl/>
-        </w:rPr>
-        <w:t xml:space="preserve">המסגרת התאורטית המקובלת להסבר הקשר בין צפייה באחרים לבין הערכת הגוף היא תאוריית ההשוואה החברתית, שלפיה אנשים מעריכים את עצמם באמצעות השוואות לדעותיהם וליכולותיהם של אחרים (Festinger, 1954, כפי שמצוטט אצל פולישוק וזיסברג, 2016). ברשתות חברתיות ההשוואה הזו מודגשת וחזקה יותר מאשר באינטראקציות פנים אל פנים, משום שהתוכן חזותי ברובו ומציג גרסה ערוכה ומסוננת של המציאות (פולישוק וזיסברג, 2016).</w:t>
-      </w:r>
-    </w:p>
-    <w:p>
-      <w:pPr>
-        <w:bidi/>
-        <w:spacing w:after="0" w:line="360"/>
-        <w:ind w:firstLine="709"/>
-        <w:jc w:val="both"/>
-      </w:pPr>
-      <w:r>
-        <w:rPr>
-          <w:rFonts w:ascii="David" w:cs="David" w:eastAsia="David" w:hAnsi="David"/>
-          <w:sz w:val="24"/>
-          <w:szCs w:val="24"/>
-          <w:rtl/>
-        </w:rPr>
-        <w:t xml:space="preserve">לתמונה זו מצטרפת נקודת מבט תאורטית נוספת. מחקר עדכני טוען שהרשתות החברתיות החליפו את המדיה המסורתית כערוץ המרכזי שדרכו מועברים אידיאלי יופי, ומציע לבחון אותן דרך תאוריית הטיפוח: סביבה שבה אדם שוהה שעות רבות מטפחת בהדרגה את תפיסותיו, עמדותיו והתנהגותו ביחס לגוף ולמשקל </w:t>
+        <w:t xml:space="preserve">דימוי גוף הוא האופן שבו אדם תופס, חושב ומרגיש כלפי גופו. הספרות רואה בהיווצרותו תהליך מתמשך, המשלב הערכות קוגניטיביות לא מודעות והשוואה לא מודעת לאחרים קרובים, על רקע נורמות והנחות תרבותיות וחברתיות. דימוי גוף ירוד אינו עניין אסתטי בלבד: הוא כרוך במצוקה נפשית ועלול להתבטא בחוסר שביעות רצון מתמשך מהמראה ובדפוסי אכילה בלתי מסתגלים (פולישוק וזיסברג, 2016).</w:t>
+      </w:r>
+    </w:p>
+    <w:p>
+      <w:pPr>
+        <w:bidi/>
+        <w:spacing w:after="0" w:line="360"/>
+        <w:ind w:firstLine="709"/>
+        <w:jc w:val="both"/>
+      </w:pPr>
+      <w:r>
+        <w:rPr>
+          <w:rFonts w:ascii="David" w:cs="David" w:eastAsia="David" w:hAnsi="David"/>
+          <w:sz w:val="24"/>
+          <w:szCs w:val="24"/>
+          <w:rtl/>
+        </w:rPr>
+        <w:t xml:space="preserve">המסגרת התאורטית המקובלת להסבר הקשר בין צפייה באחרים לבין הערכת הגוף היא תאוריית ההשוואה החברתית, שלפיה אנשים מעריכים את עצמם באמצעות השוואות לדעותיהם וליכולותיהם של אחרים (Festinger, 1954, כפי שמצוטט אצל פולישוק וזיסברג, 2016). ברשתות חברתיות ההשוואה מודגשת וחזקה יותר מאשר באינטראקציות פנים אל פנים: התוכן חזותי ברובו, תמונות עוברות בחירה וסינון קפדניים לפני פרסומן, ותמונות מקצועיות עוברות מניפולציה דיגיטלית היוצרת סטנדרט יופי שאינו בר השגה במציאות. ההשוואות התכופות והחשיפה בעלת האופי השיפוטי עלולות להביא לחוסר שביעות רצון מהמראה החיצוני (פולישוק וזיסברג, 2016).</w:t>
+      </w:r>
+    </w:p>
+    <w:p>
+      <w:pPr>
+        <w:bidi/>
+        <w:spacing w:after="0" w:line="360"/>
+        <w:ind w:firstLine="709"/>
+        <w:jc w:val="both"/>
+      </w:pPr>
+      <w:r>
+        <w:rPr>
+          <w:rFonts w:ascii="David" w:cs="David" w:eastAsia="David" w:hAnsi="David"/>
+          <w:sz w:val="24"/>
+          <w:szCs w:val="24"/>
+          <w:rtl/>
+        </w:rPr>
+        <w:t xml:space="preserve">לצד ההשוואה החברתית מציעה הספרות מסגרת נוספת: תאוריית הטיפוח. לפי גישה זו, הרשתות החברתיות החליפו את המדיה המסורתית כערוץ המרכזי שדרכו מועברים אידיאלי יופי, וסביבה שאדם שוהה בה שעות רבות מדי יום מעצבת בהדרגה את תפיסותיו, עמדותיו והתנהגותו. חוקרים המיישמים גישה זו על דימוי גוף מבחינים בין שלושה סוגי השפעה: שינוי בידע ובאומדנים הקשורים למשקל, שינוי בעמדות כלפי מראה ומשקל, ושינוי התנהגותי בדפוסי האכילה </w:t>
       </w:r>
       <w:r>
         <w:rPr>
@@ -626,6 +660,40 @@
           <w:szCs w:val="24"/>
         </w:rPr>
         <w:t xml:space="preserve">(Stein et al., 2021)</w:t>
+      </w:r>
+      <w:r>
+        <w:rPr>
+          <w:rFonts w:ascii="David" w:cs="David" w:eastAsia="David" w:hAnsi="David"/>
+          <w:sz w:val="24"/>
+          <w:szCs w:val="24"/>
+          <w:rtl/>
+        </w:rPr>
+        <w:t xml:space="preserve">.</w:t>
+      </w:r>
+    </w:p>
+    <w:p>
+      <w:pPr>
+        <w:bidi/>
+        <w:spacing w:after="0" w:line="360"/>
+        <w:ind w:firstLine="709"/>
+        <w:jc w:val="both"/>
+      </w:pPr>
+      <w:r>
+        <w:rPr>
+          <w:rFonts w:ascii="David" w:cs="David" w:eastAsia="David" w:hAnsi="David"/>
+          <w:sz w:val="24"/>
+          <w:szCs w:val="24"/>
+          <w:rtl/>
+        </w:rPr>
+        <w:t xml:space="preserve">יש להבחין בין דימוי גוף לבין ערך עצמי כללי: השניים קשורים זה בזה אך אינם זהים, ומחקרים בתחום מודדים אותם בנפרד, למשל באמצעות שאלון צורת הגוף וסולם ההערכה העצמית של רוזנברג. פגיעה בדימוי הגוף נמצאה שלובה בירידה בערך העצמי בקרב משתמשי רשתות צעירים </w:t>
+      </w:r>
+      <w:r>
+        <w:rPr>
+          <w:rFonts w:ascii="Times New Roman" w:cs="Times New Roman" w:eastAsia="Times New Roman" w:hAnsi="Times New Roman"/>
+          <w:sz w:val="24"/>
+          <w:szCs w:val="24"/>
+        </w:rPr>
+        <w:t xml:space="preserve">(Molina Ruiz et al., 2022)</w:t>
       </w:r>
       <w:r>
         <w:rPr>
@@ -674,7 +742,7 @@
           <w:szCs w:val="24"/>
           <w:rtl/>
         </w:rPr>
-        <w:t xml:space="preserve">המחקר הרחב מבין השלושה נערך בספרד ובדק 585 בוגרים בגילאי 40-18 באמצעות שאלון דימוי גוף, סולם הערכה עצמית של רוזנברג וסולם השוואת מראה. נמצא מתאם חיובי בין תדירות השימוש באינסטגרם לבין חוסר שביעות רצון מהגוף וערך עצמי נמוך, וזמן הצפייה בתכנים ניבא את שני המשתנים. סוג התוכן שפורסם או נצפה לא נמצא קשור לתוצאות, ואילו הנטייה להשוות את המראה לאחרים נמצאה מתווכת את הקשר </w:t>
+        <w:t xml:space="preserve">שלושה מחקרים אמפיריים מהעשור האחרון בחנו את הקשר הזה באוכלוסיות של בוגרים צעירים, כל אחד בפלטפורמה אחרת ובכלים אחרים, והשוואה ביניהם היא לב העבודה. המחקר הרחב מבין השלושה נערך בספרד ובדק 585 בוגרים בגילאי 40-18 באמצעות שאלון צורת הגוף, סולם ההערכה העצמית של רוזנברג וסולם השוואת מראה. נמצא מתאם חיובי בין תדירות השימוש באינסטגרם לבין חוסר שביעות רצון מהגוף וערך עצמי נמוך, וזמן הצפייה בתכנים ניבא את שני המשתנים. מעניין שסוג התוכן, הן זה שפורסם הן זה שנצפה, לא נמצא קשור לתוצאות, ואילו הנטייה להשוות את המראה לאחרים נמצאה מתווכת את הקשר: מי שנוטים להשוות את עצמם הם שנפגעים </w:t>
       </w:r>
       <w:r>
         <w:rPr>
@@ -708,7 +776,7 @@
           <w:szCs w:val="24"/>
           <w:rtl/>
         </w:rPr>
-        <w:t xml:space="preserve">מחקר גרמני בקרב 228 צעירים בגילאי 34-18 מספק תמונה מדויקת יותר של דפוסי השימוש. כאשר הופרדה כמות השימוש מאיכותו התברר שזמן שימוש כשלעצמו אינו מנבא דבר. המנבא היחיד היה נטיית המשתתפים לגלוש בתכנים ציבוריים של זרים: נטייה זו נקשרה לעמדות מחמירות כלפי משקלם ומראם של אחרים, בעיקר בקרב נשים, ולסיכון גבוה יותר לאכילה מופרעת בשני המינים. דווקא הקשר שצפו החוקרים בין הגלישה לבין ירידה בשביעות הרצון מהגוף עצמו לא נמצא </w:t>
+        <w:t xml:space="preserve">מחקר גרמני בקרב 228 צעירים בגילאי 34-18 מספק תמונה מדויקת יותר של דפוסי השימוש. החוקרים הפרידו בין כמות השימוש באינסטגרם לבין איכותו, ובחנו שלושה סוגי תוצאה בהתאם לתאוריית הטיפוח: ידע ואומדנים לגבי משקל, עמדות כלפי מראה, ואיפוק אכילה מדווח. התברר שזמן שימוש כשלעצמו אינו מנבא דבר. המנבא היחיד היה נטיית המשתתפים לגלוש בתכנים ציבוריים של זרים: נטייה זו נקשרה לעמדות מחמירות כלפי משקלם ומראם של אחרים, בעיקר בקרב נשים, ולסיכון גבוה יותר לאכילה מופרעת בשני המינים. דווקא הקשר שצפו החוקרים בין הגלישה לבין ירידה בשביעות הרצון מהגוף עצמו לא נמצא, והם מציעים שחשיפה ממושכת לתמונות של זרים מטפחת קודם כול מבט שיפוטי כלפי גופם של אחרים </w:t>
       </w:r>
       <w:r>
         <w:rPr>
@@ -742,24 +810,24 @@
           <w:szCs w:val="24"/>
           <w:rtl/>
         </w:rPr>
-        <w:t xml:space="preserve">המאמר המוביל של העבודה נערך בישראל, בקרב 127 צעירים וצעירות בגילאי 25-18, ובדק שאלון דימוי גוף, שאלון שימוש בפייסבוק ושאלון אינטליגנציה רגשית כתכונה. גם כאן הממצאים סטו מן המשוער: במקום קשר שלילי נמצא קשר חיובי מתון בין חשיפה לתוכני תמונות לבין דימוי גוף, וקשר זה איבד את מובהקותו כאשר נכללה אינטליגנציה רגשית במודל. ניתוח נתיבים העלה שלאינטליגנציה רגשית אפקט ישיר הן על מידת החשיפה לתכנים חזותיים הן על דימוי הגוף. החוקרים מציעים שאופיו המתאמי של המחקר עשוי להסביר את הכיוון המפתיע: ייתכן שדווקא מי שדימוי גופם חיובי מרבים להיחשף לתמונות (פולישוק וזיסברג, 2016).</w:t>
-      </w:r>
-    </w:p>
-    <w:p>
-      <w:pPr>
-        <w:bidi/>
-        <w:spacing w:after="0" w:line="360"/>
-        <w:ind w:firstLine="709"/>
-        <w:jc w:val="both"/>
-      </w:pPr>
-      <w:r>
-        <w:rPr>
-          <w:rFonts w:ascii="David" w:cs="David" w:eastAsia="David" w:hAnsi="David"/>
-          <w:sz w:val="24"/>
-          <w:szCs w:val="24"/>
-          <w:rtl/>
-        </w:rPr>
-        <w:t xml:space="preserve">קריאה משולבת של שלושת המחקרים מלמדת יותר מכל אחד מהם בנפרד. שלושתם מזהים את ההשוואה החברתית כמנגנון פעיל, ושניים מהם מראים שאופן השימוש חשוב מכמותו: בספרד הקשר תווך על ידי נטיית ההשוואה, ובגרמניה רק גלישה בתכני זרים ניבאה פגיעה. עם זאת יש ביניהם הבדלים ממשיים. הם נבדלים בכיוון הממצאים, בפלטפורמה הנבדקת ובמדדים, והממצא הישראלי ההפוך מזכיר שהקשר אינו דטרמיניסטי. שלושתם מחקרים מתאמיים, ולכן איש מהם אינו יכול לקבוע מה קודם למה: החשיפה לדימוי הגוף או דימוי הגוף לחשיפה (פולישוק וזיסברג, 2016; </w:t>
+        <w:t xml:space="preserve">המאמר המוביל של העבודה נערך בישראל, בקרב 127 צעירים וצעירות בגילאי 25-18, ובדק שאלון דימוי גוף, שאלון מידת שימוש בפייסבוק ושאלון אינטליגנציה רגשית כתכונה. השערת החוקרים הייתה שאינטליגנציה רגשית תמתן קשר שלילי בין חשיפה לתכנים חזותיים לבין דימוי גוף, אך הממצאים סטו מן המשוער: במקום קשר שלילי נמצא קשר חיובי מתון בין חשיפה לתוכני תמונות לבין דימוי גוף, וקשר זה איבד את מובהקותו כאשר נכללה אינטליגנציה רגשית במודל. ניתוח נתיבים העלה שלאינטליגנציה רגשית אפקט ישיר הן על מידת החשיפה לתכנים חזותיים הן על דימוי הגוף. החוקרים מציעים שאופיו המתאמי של המחקר עשוי להסביר את הכיוון המפתיע: ייתכן שדווקא מי שדימוי גופם חיובי מרבים להעלות תמונות ולהיחשף אליהן (פולישוק וזיסברג, 2016).</w:t>
+      </w:r>
+    </w:p>
+    <w:p>
+      <w:pPr>
+        <w:bidi/>
+        <w:spacing w:after="0" w:line="360"/>
+        <w:ind w:firstLine="709"/>
+        <w:jc w:val="both"/>
+      </w:pPr>
+      <w:r>
+        <w:rPr>
+          <w:rFonts w:ascii="David" w:cs="David" w:eastAsia="David" w:hAnsi="David"/>
+          <w:sz w:val="24"/>
+          <w:szCs w:val="24"/>
+          <w:rtl/>
+        </w:rPr>
+        <w:t xml:space="preserve">קריאה משולבת של שלושת המחקרים מלמדת יותר מכל אחד מהם בנפרד. בנקודה אחת הם מחזקים זה את זה: שלושתם מצביעים על כך שהמנגנון הפעיל הוא ההשוואה לאחרים, ולא החשיפה כשלעצמה. בספרד הקשר תווך על ידי נטיית ההשוואה, בגרמניה רק גלישה בתכני זרים ניבאה פגיעה, ובישראל הכריעו את התמונה ההבדלים בין אנשים במשאב רגשי פנימי. ההבדלים בין המחקרים חשובים לא פחות: הם נבדלים בפלטפורמה הנבדקת, במדדים ובכיוון הממצאים, והממצא הישראלי ההפוך מזכיר שהקשר אינו דטרמיניסטי ואינו אחיד בכל מדגם. מגבלה משותפת לשלושתם היא היותם מחקרים מתאמיים המבוססים על דיווח עצמי, ולכן איש מהם אינו יכול לקבוע מה קודם למה: החשיפה לדימוי הגוף או דימוי הגוף לחשיפה (פולישוק וזיסברג, 2016; </w:t>
       </w:r>
       <w:r>
         <w:rPr>
@@ -816,24 +884,24 @@
           <w:szCs w:val="24"/>
           <w:rtl/>
         </w:rPr>
-        <w:t xml:space="preserve">הממצא הישראלי מפנה את תשומת הלב למשאבים אישיים. אינטליגנציה רגשית, כלומר היכולת לזהות רגשות, להבין אותם ולווסתם, נמצאה קשורה במישרין לדימוי גוף חיובי, והכללתה במודל ביטלה את הקשר שבין חשיפה לתמונות לבין דימוי הגוף. מכאן שההבדלים בין צעירים בעמידותם מול תכני הרשת עשויים להיות חשובים מן החשיפה עצמה, ושפיתוח מיומנויות רגשיות במערכת החינוך, מהיסודי ועד האקדמי, הוא אפיק התערבות מעשי (פולישוק וזיסברג, 2016).</w:t>
-      </w:r>
-    </w:p>
-    <w:p>
-      <w:pPr>
-        <w:bidi/>
-        <w:spacing w:after="0" w:line="360"/>
-        <w:ind w:firstLine="709"/>
-        <w:jc w:val="both"/>
-      </w:pPr>
-      <w:r>
-        <w:rPr>
-          <w:rFonts w:ascii="David" w:cs="David" w:eastAsia="David" w:hAnsi="David"/>
-          <w:sz w:val="24"/>
-          <w:szCs w:val="24"/>
-          <w:rtl/>
-        </w:rPr>
-        <w:t xml:space="preserve">כיוון שני נוגע להרגלי השימוש. אם הפגיעה קשורה בעיקר לגלישה פסיבית בפרופילים של זרים ולא לזמן המסך הכולל, הדרכה של צעירים יכולה להתמקד בשאלה מה צופים, יותר מאשר בשאלה כמה: העדפת קשר עם מכרים על פני צריכת תכנים של משפיענים, ומודעות לכך שהפיד הציבורי מציג מדגם מוטה של גופים </w:t>
+        <w:t xml:space="preserve">הממצא הישראלי מפנה את תשומת הלב למשאבים אישיים כנקודת התערבות. אינטליגנציה רגשית, כלומר מכלול היכולות לזהות רגשות, להבין אותם ולווסתם, נמצאה קשורה במישרין לדימוי גוף חיובי, והכללתה במודל ביטלה את הקשר שבין חשיפה לתמונות לבין דימוי הגוף. מכאן שההבדלים בין צעירים בעמידותם מול תכני הרשת עשויים להיות חשובים מן החשיפה עצמה. החוקרים מדגישים שמדובר במושג רלוונטי לקהל היעד של מערכת החינוך כולה, מהיסודי ועד האקדמי, ולכן פיתוח מיומנויות רגשיות במסגרות חינוך הוא אפיק התערבות מעשי וזמין (פולישוק וזיסברג, 2016).</w:t>
+      </w:r>
+    </w:p>
+    <w:p>
+      <w:pPr>
+        <w:bidi/>
+        <w:spacing w:after="0" w:line="360"/>
+        <w:ind w:firstLine="709"/>
+        <w:jc w:val="both"/>
+      </w:pPr>
+      <w:r>
+        <w:rPr>
+          <w:rFonts w:ascii="David" w:cs="David" w:eastAsia="David" w:hAnsi="David"/>
+          <w:sz w:val="24"/>
+          <w:szCs w:val="24"/>
+          <w:rtl/>
+        </w:rPr>
+        <w:t xml:space="preserve">כיוון שני נוגע להרגלי השימוש עצמם. אם הפגיעה קשורה בעיקר לגלישה פסיבית בפרופילים ציבוריים של זרים, ואינה קשורה לזמן המסך הכולל, הדרכה של צעירים יכולה להתמקד בשאלה מה צופים, יותר מאשר בשאלה כמה: העדפת אינטראקציה עם מכרים על פני צריכת תכנים של משפיענים וזרים, ומודעות לכך שהפיד הציבורי מציג מדגם מוטה וערוך של גופים </w:t>
       </w:r>
       <w:r>
         <w:rPr>
@@ -867,7 +935,7 @@
           <w:szCs w:val="24"/>
           <w:rtl/>
         </w:rPr>
-        <w:t xml:space="preserve">ברמת המערכת, החוקרים הספרדים קוראים לגבש מדיניות מניעה שתגן על בריאותם הנפשית של המשתמשים </w:t>
+        <w:t xml:space="preserve">ברמת המערכת, החוקרים הספרדים קוראים לגבש מדיניות מניעה שתגן על בריאותם הנפשית של משתמשי הרשתות, לאור הקשר שנמצא בין תדירות השימוש לבין פגיעה בדימוי הגוף ובערך העצמי </w:t>
       </w:r>
       <w:r>
         <w:rPr>
@@ -884,7 +952,24 @@
           <w:szCs w:val="24"/>
           <w:rtl/>
         </w:rPr>
-        <w:t xml:space="preserve">. קריאה זו עולה בקנה אחד עם הדגש על אוריינות דיגיטלית של הורים וילדים כאחד, שנועדה להגביר מודעות לסיכונים מקוונים ולסייע במציאת איזון בין החיים המקוונים לאלה שמחוץ לרשת (אליאס, 2022).</w:t>
+        <w:t xml:space="preserve">. קריאה זו משתלבת בגישה רחבה יותר של אוריינות דיגיטלית: הקניית כלים להורים ולילדים להבין את הסביבה המקוונת, לזהות את סיכוניה ולמצוא איזון בין החיים המקוונים לאלה שמחוץ לרשת (אליאס, 2022).</w:t>
+      </w:r>
+    </w:p>
+    <w:p>
+      <w:pPr>
+        <w:bidi/>
+        <w:spacing w:after="0" w:line="360"/>
+        <w:ind w:firstLine="709"/>
+        <w:jc w:val="both"/>
+      </w:pPr>
+      <w:r>
+        <w:rPr>
+          <w:rFonts w:ascii="David" w:cs="David" w:eastAsia="David" w:hAnsi="David"/>
+          <w:sz w:val="24"/>
+          <w:szCs w:val="24"/>
+          <w:rtl/>
+        </w:rPr>
+        <w:t xml:space="preserve">ראוי שדרכי ההתמודדות לא יתבססו על הרחקה גורפת מהרשתות. המדיה הדיגיטליים תורמים גם לרווחה, ללמידה ולקשר חברתי, והרשת משמשת לצעירים מרחב של יצירתיות והבניית זהות. התמודדות מאוזנת תכיר בתפקיד החיובי הזה ותכוון לשימוש מודע ומיטיב, ולא לאיסור (אליאס, 2022; יאיר, 2025).</w:t>
       </w:r>
     </w:p>
     <w:p>
@@ -924,7 +1009,7 @@
           <w:szCs w:val="24"/>
           <w:rtl/>
         </w:rPr>
-        <w:t xml:space="preserve">העבודה שאלה כיצד קשורה חשיפה לרשתות חברתיות לדימוי הגוף של בוגרים צעירים. התשובה שעולה מן המקורות אינה חד משמעית, וזה עיקר הלקח: תדירות השימוש קשורה לחוסר שביעות רצון מהגוף במדגם אחד, אינה מנבאת דבר במדגם אחר, ובמדגם הישראלי נמצא אף קשר חיובי שנעלם בנוכחות אינטליגנציה רגשית. המשותף לכולם הוא מנגנון ההשוואה החברתית וההכרה בכך שאופן השימוש ומשאבי הפרט מכריעים יותר מזמן המסך (פולישוק וזיסברג, 2016; </w:t>
+        <w:t xml:space="preserve">העבודה שאלה כיצד קשורה חשיפה לרשתות חברתיות לדימוי הגוף של בוגרים צעירים. התשובה שעולה מן המקורות אינה חד משמעית, וזה עיקר הלקח: תדירות השימוש קשורה לחוסר שביעות רצון מהגוף במדגם אחד, אינה מנבאת דבר במדגם אחר, ובמדגם הישראלי נמצא אף קשר חיובי שנעלם בנוכחות אינטליגנציה רגשית. המשותף לכל המחקרים הוא מנגנון ההשוואה החברתית וההכרה בכך שאופן השימוש ומשאבי הפרט מכריעים יותר מזמן המסך (פולישוק וזיסברג, 2016; </w:t>
       </w:r>
       <w:r>
         <w:rPr>
@@ -958,7 +1043,7 @@
           <w:szCs w:val="24"/>
           <w:rtl/>
         </w:rPr>
-        <w:t xml:space="preserve">מן הממצאים נגזרות שלוש המלצות מעשיות: לשלב תוכני אוריינות דיגיטלית העוסקים במפורש בדימוי גוף בתוכניות חינוך למכינות ולמוסדות אקדמיים; לטפח מיומנויות של זיהוי וויסות רגשות כחלק מהכשרת צעירים; ולהדריך שימוש מודע ברשתות, המעדיף אינטראקציה עם מכרים על פני גלישה בתכני זרים. מחקר המשך ראוי שיהיה מחקר אורך, שיוכל לבחון את כיוון הקשר לאורך זמן.</w:t>
+        <w:t xml:space="preserve">מן הממצאים נגזרות המלצות מעשיות: לשלב בתוכניות חינוך למכינות ולמוסדות אקדמיים תוכני אוריינות דיגיטלית העוסקים במפורש בדימוי גוף ובאופי הערוך של התמונות ברשת; לטפח מיומנויות של זיהוי וויסות רגשות כחלק מהכשרת צעירים; ולהדריך שימוש מודע ברשתות, המעדיף אינטראקציה עם מכרים על פני גלישה בתכני זרים. מחקר המשך ראוי שיהיה מחקר אורך, שיוכל לבחון את כיוון הקשר לאורך זמן ולבדוק את יעילותן של דרכי ההתערבות.</w:t>
       </w:r>
     </w:p>
     <w:p>

</xml_diff>

<commit_message>
Match section 8 page budget: continuous body chapters, fuller abstract and intro
Co-Authored-By: Claude Fable 5 <noreply@anthropic.com>
Claude-Session: https://claude.ai/code/session_01XMxbVW1mQoeJZiQuhYdABE
</commit_message>
<xml_diff>
--- a/הקשר בין חשיפה לרשתות חברתיות לבין דימוי גוף - עבודה מסכמת.docx
+++ b/הקשר בין חשיפה לרשתות חברתיות לבין דימוי גוף - עבודה מסכמת.docx
@@ -213,7 +213,7 @@
     <w:p>
       <w:pPr>
         <w:bidi/>
-        <w:spacing w:after="120" w:before="0" w:line="360"/>
+        <w:spacing w:after="120" w:before="240" w:line="360"/>
         <w:jc w:val="right"/>
       </w:pPr>
       <w:r>
@@ -242,7 +242,7 @@
           <w:szCs w:val="24"/>
           <w:rtl/>
         </w:rPr>
-        <w:t xml:space="preserve">עבודה זו בוחנת את הקשר שבין חשיפה לרשתות חברתיות לבין דימוי גוף בקרב בוגרים צעירים. הרשתות החברתיות הן חלק משגרת יומם של צעירים בישראל ובעולם, והתכנים המרכזיים בהן הם תמונות: תמונות של חברים ושל המשתמש עצמו, הזוכות לדירוג מיידי בלייקים ובתגובות. מצב זה מעורר את השאלה כיצד קשורה החשיפה המתמדת לתכנים חזותיים אלה לאופן שבו צעירים תופסים את גופם, דווקא בתקופת חיים שבה המראה החיצוני נקשר לזוגיות, לתעסוקה ולערך העצמי.</w:t>
+        <w:t xml:space="preserve">עבודה זו בוחנת את הקשר שבין חשיפה לרשתות חברתיות לבין דימוי גוף בקרב בוגרים צעירים. הרשתות החברתיות הן חלק משגרת יומם של צעירים בישראל ובעולם, והתכנים המרכזיים בהן הם תמונות: תמונות של חברים ושל המשתמש עצמו, הזוכות לדירוג מיידי בלייקים ובתגובות. מצב זה מעורר את השאלה כיצד קשורה החשיפה המתמדת לתכנים חזותיים אלה לאופן שבו צעירים תופסים את גופם, דווקא בתקופת חיים שבה המראה החיצוני נקשר לזוגיות, לתעסוקה ולערך העצמי. סוגיה זו מעסיקה חוקרים, אנשי חינוך והורים כאחד, שכן דור שלם מנהל חלק ניכר מחייו החברתיים מול מסך.</w:t>
       </w:r>
     </w:p>
     <w:p>
@@ -327,7 +327,7 @@
           <w:szCs w:val="24"/>
           <w:rtl/>
         </w:rPr>
-        <w:t xml:space="preserve">המסקנה המרכזית היא שהשאלה אינה כמה זמן צעירים מבלים ברשתות, אלא מה הם עושים שם ובאילו משאבים אישיים הם מצוידים. על בסיס זה מוצעות בסוף העבודה המלצות מעשיות: שילוב אוריינות דיגיטלית העוסקת בדימוי גוף בתוכניות חינוך, טיפוח מיומנויות רגשיות והדרכה לשימוש מודע ברשתות, לצד הצעות למחקר המשך.</w:t>
+        <w:t xml:space="preserve">המסקנה המרכזית היא שהשאלה אינה כמה זמן צעירים מבלים ברשתות, אלא מה הם עושים שם ובאילו משאבים אישיים הם מצוידים. על בסיס זה מוצעות בסוף העבודה המלצות מעשיות: שילוב אוריינות דיגיטלית העוסקת בדימוי גוף בתוכניות חינוך, טיפוח מיומנויות רגשיות והדרכה לשימוש מודע ברשתות, לצד הצעות למחקר המשך. עוד עולה מן הסקירה שהרשתות אינן גורם שלילי במהותו: הן משמשות גם מרחב של למידה, יצירתיות וקשר חברתי, ולכן השאלה שראוי לשאול אינה אם להשתמש בהן אלא כיצד.</w:t>
       </w:r>
     </w:p>
     <w:p>
@@ -338,7 +338,7 @@
     <w:p>
       <w:pPr>
         <w:bidi/>
-        <w:spacing w:after="120" w:before="0" w:line="360"/>
+        <w:spacing w:after="120" w:before="240" w:line="360"/>
         <w:jc w:val="right"/>
       </w:pPr>
       <w:r>
@@ -469,7 +469,7 @@
           <w:szCs w:val="24"/>
           <w:rtl/>
         </w:rPr>
-        <w:t xml:space="preserve">מבנה העבודה הולך מן הרחב אל הצר, בשיטת המשפך. הפרק הראשון פותח בנושא הכללי: מדיה חברתית ורשתות חברתיות, הגדרתן ומקומן בחיי צעירים. הפרק השני מצטמצם אל המושג דימוי גוף ואל המנגנונים המסבירים כיצד הוא מושפע מן הסביבה. הפרק השלישי, לב העבודה, מגיע אל הנושא הספציפי ומשווה בין ממצאי שלושת המחקרים האמפיריים. הפרק הרביעי דן בדרכי התמודדות, ואחריו מובאים סיכום קצר ורשימת מקורות.</w:t>
+        <w:t xml:space="preserve">מבנה העבודה הולך מן הרחב אל הצר, בשיטת המשפך. הפרק הראשון פותח בנושא הכללי: מדיה חברתית ורשתות חברתיות, הגדרתן ומקומן בחיי צעירים. הפרק השני מצטמצם אל המושג דימוי גוף ואל המנגנונים המסבירים כיצד הוא מושפע מן הסביבה. הפרק השלישי, לב העבודה, מגיע אל הנושא הספציפי ומשווה בין ממצאי שלושת המחקרים האמפיריים. הפרק הרביעי דן בדרכי התמודדות, ואחריו מובאים סיכום קצר ורשימת מקורות. בכל אחד מן הפרקים משולבים לפחות שני מקורות, ברוח הכתיבה האינטגרטיבית שהעבודה נדרשת לה.</w:t>
       </w:r>
     </w:p>
     <w:p>
@@ -480,7 +480,7 @@
     <w:p>
       <w:pPr>
         <w:bidi/>
-        <w:spacing w:after="120" w:before="0" w:line="360"/>
+        <w:spacing w:after="120" w:before="240" w:line="360"/>
         <w:jc w:val="right"/>
       </w:pPr>
       <w:r>
@@ -581,14 +581,9 @@
       </w:r>
     </w:p>
     <w:p>
-      <w:r>
-        <w:br w:type="page"/>
-      </w:r>
-    </w:p>
-    <w:p>
-      <w:pPr>
-        <w:bidi/>
-        <w:spacing w:after="120" w:before="0" w:line="360"/>
+      <w:pPr>
+        <w:bidi/>
+        <w:spacing w:after="120" w:before="240" w:line="360"/>
         <w:jc w:val="right"/>
       </w:pPr>
       <w:r>
@@ -706,14 +701,9 @@
       </w:r>
     </w:p>
     <w:p>
-      <w:r>
-        <w:br w:type="page"/>
-      </w:r>
-    </w:p>
-    <w:p>
-      <w:pPr>
-        <w:bidi/>
-        <w:spacing w:after="120" w:before="0" w:line="360"/>
+      <w:pPr>
+        <w:bidi/>
+        <w:spacing w:after="120" w:before="240" w:line="360"/>
         <w:jc w:val="right"/>
       </w:pPr>
       <w:r>
@@ -848,14 +838,9 @@
       </w:r>
     </w:p>
     <w:p>
-      <w:r>
-        <w:br w:type="page"/>
-      </w:r>
-    </w:p>
-    <w:p>
-      <w:pPr>
-        <w:bidi/>
-        <w:spacing w:after="120" w:before="0" w:line="360"/>
+      <w:pPr>
+        <w:bidi/>
+        <w:spacing w:after="120" w:before="240" w:line="360"/>
         <w:jc w:val="right"/>
       </w:pPr>
       <w:r>
@@ -973,14 +958,9 @@
       </w:r>
     </w:p>
     <w:p>
-      <w:r>
-        <w:br w:type="page"/>
-      </w:r>
-    </w:p>
-    <w:p>
-      <w:pPr>
-        <w:bidi/>
-        <w:spacing w:after="120" w:before="0" w:line="360"/>
+      <w:pPr>
+        <w:bidi/>
+        <w:spacing w:after="120" w:before="240" w:line="360"/>
         <w:jc w:val="right"/>
       </w:pPr>
       <w:r>
@@ -1054,7 +1034,7 @@
     <w:p>
       <w:pPr>
         <w:bidi/>
-        <w:spacing w:after="120" w:before="0" w:line="360"/>
+        <w:spacing w:after="120" w:before="240" w:line="360"/>
         <w:jc w:val="right"/>
       </w:pPr>
       <w:r>

</xml_diff>

<commit_message>
Replace WhatsApp humor article with Latzer 2016 on media and eating disorders
Co-Authored-By: Claude Fable 5 <noreply@anthropic.com>
Claude-Session: https://claude.ai/code/session_01XMxbVW1mQoeJZiQuhYdABE
</commit_message>
<xml_diff>
--- a/הקשר בין חשיפה לרשתות חברתיות לבין דימוי גוף - עבודה מסכמת.docx
+++ b/הקשר בין חשיפה לרשתות חברתיות לבין דימוי גוף - עבודה מסכמת.docx
@@ -418,7 +418,7 @@
           <w:szCs w:val="24"/>
           <w:rtl/>
         </w:rPr>
-        <w:t xml:space="preserve">שאלת העבודה היא אפוא: מה ידוע במחקר על הקשר שבין חשיפה לרשתות חברתיות לבין דימוי גוף בקרב בוגרים צעירים, ומה ניתן ללמוד ממנו על דרכי התמודדות. העבודה מבוססת על סיכום אינטגרטיבי של חמישה מקורות. המאמר המוביל הוא מחקרם של פולישוק וזיסברג (2016), שנערך בקרב בוגרים צעירים בישראל ובחן את הקשרים בין אינטליגנציה רגשית, חשיפה לתוכני תמונות בפייסבוק ודימוי גוף. לצדו נסקרים מאמרה של אליאס (2022) על ילדות דיגיטלית, מחקרה של יאיר (2025) על שפת בני נוער בווטסאפ, מחקר גרמני שיישם את תאוריית הטיפוח על אינסטגרם </w:t>
+        <w:t xml:space="preserve">שאלת העבודה היא אפוא: מה ידוע במחקר על הקשר שבין חשיפה לרשתות חברתיות לבין דימוי גוף בקרב בוגרים צעירים, ומה ניתן ללמוד ממנו על דרכי התמודדות. העבודה מבוססת על סיכום אינטגרטיבי של חמישה מקורות. המאמר המוביל הוא מחקרם של פולישוק וזיסברג (2016), שנערך בקרב בוגרים צעירים בישראל ובחן את הקשרים בין אינטליגנציה רגשית, חשיפה לתוכני תמונות בפייסבוק ודימוי גוף. לצדו נסקרים מאמרה של אליאס (2022) על ילדות דיגיטלית, סקירתה של לצר (2016) על תפקיד המדיה בהתפתחות הפרעות אכילה, מחקר גרמני שיישם את תאוריית הטיפוח על אינסטגרם </w:t>
       </w:r>
       <w:r>
         <w:rPr>
@@ -560,24 +560,24 @@
           <w:szCs w:val="24"/>
           <w:rtl/>
         </w:rPr>
-        <w:t xml:space="preserve">הרשתות הן גם מרחב שבו צעירים יוצרים תרבות משלהם. מחקר נטנוגרפי שניתח 1,150 תשדורות ווטסאפ של בני נוער בישראל, לצד ראיונות עם שנים עשר מהם, מצא שהם מפתחים בתוך הפלטפורמה שפה ייחודית: שגיאות כתיב מכוונות, מניפולציות גרפיות על הטקסט והומור משמשים אותם לניהול קשרים חברתיים, להבניית זהות ולהבעת רגשות, ונורמות לשוניות חדשות נוצרות שם כל הזמן. הרשת מתפקדת עבורם כמרחב חברתי דינמי שבו הם חיים ממש (יאיר, 2025).</w:t>
-      </w:r>
-    </w:p>
-    <w:p>
-      <w:pPr>
-        <w:bidi/>
-        <w:spacing w:after="0" w:line="360"/>
-        <w:ind w:firstLine="709"/>
-        <w:jc w:val="both"/>
-      </w:pPr>
-      <w:r>
-        <w:rPr>
-          <w:rFonts w:ascii="David" w:cs="David" w:eastAsia="David" w:hAnsi="David"/>
-          <w:sz w:val="24"/>
-          <w:szCs w:val="24"/>
-          <w:rtl/>
-        </w:rPr>
-        <w:t xml:space="preserve">שני המקורות הללו משרטטים את הרקע לעבודה: אם הרשת היא הזירה שבה צעירים מציגים את עצמם, נמדדים ונבחנים מול אחרים, מתבקש לשאול מה קורה שם לאחד הרכיבים הרגישים של העצמי, הוא דימוי הגוף (אליאס, 2022; יאיר, 2025).</w:t>
+        <w:t xml:space="preserve">כוחה של המדיה בעיצוב תפיסות על הגוף אינו חדש. עוד לפני עידן הרשתות ייחסה הספרות למדיה תפקיד מרכזי בהפצת מסרים חברתיים-תרבותיים על יופי ורזון, וילדים ומתבגרים נמצאו מפנימים בקלות מסרים על יופי, מבנה גוף ודיאטה כמדדים להצלחה ולהנאה. הרשתות החברתיות ירשו את התפקיד הזה והעצימו אותו, שכן המסרים מגיעים בהן מכל עבר ולאורך כל שעות היום (לצר, 2016).</w:t>
+      </w:r>
+    </w:p>
+    <w:p>
+      <w:pPr>
+        <w:bidi/>
+        <w:spacing w:after="0" w:line="360"/>
+        <w:ind w:firstLine="709"/>
+        <w:jc w:val="both"/>
+      </w:pPr>
+      <w:r>
+        <w:rPr>
+          <w:rFonts w:ascii="David" w:cs="David" w:eastAsia="David" w:hAnsi="David"/>
+          <w:sz w:val="24"/>
+          <w:szCs w:val="24"/>
+          <w:rtl/>
+        </w:rPr>
+        <w:t xml:space="preserve">המקורות הללו משרטטים את הרקע לעבודה: אם הרשת היא הזירה שבה צעירים מציגים את עצמם, נמדדים ונבחנים מול אחרים, מתבקש לשאול מה קורה שם לאחד הרכיבים הרגישים של העצמי, הוא דימוי הגוף (אליאס, 2022; לצר, 2016).</w:t>
       </w:r>
     </w:p>
     <w:p>
@@ -629,6 +629,23 @@
           <w:szCs w:val="24"/>
           <w:rtl/>
         </w:rPr>
+        <w:t xml:space="preserve">המודל החברתי-תרבותי להתפתחות הפרעות אכילה מדגיש את חלקם של מסרים ונורמות חברתיות, ובראשם אידיאל הרזון, בהתפתחותן ובביסוסן של ההפרעות. הפגיעות הגדולה ביותר היא של נערות מתבגרות ונשים צעירות, הנמצאות בתקופה התפתחותית קריטית שבה מסרים על יופי ועל מבנה גוף מופנמים בקלות והופכים לאמת מידה להערכה עצמית. הפנמת אידיאל הרזון נחשבת אחד מגורמי הסיכון המרכזיים לחוסר שביעות רצון מהגוף ולהפרעות אכילה (לצר, 2016).</w:t>
+      </w:r>
+    </w:p>
+    <w:p>
+      <w:pPr>
+        <w:bidi/>
+        <w:spacing w:after="0" w:line="360"/>
+        <w:ind w:firstLine="709"/>
+        <w:jc w:val="both"/>
+      </w:pPr>
+      <w:r>
+        <w:rPr>
+          <w:rFonts w:ascii="David" w:cs="David" w:eastAsia="David" w:hAnsi="David"/>
+          <w:sz w:val="24"/>
+          <w:szCs w:val="24"/>
+          <w:rtl/>
+        </w:rPr>
         <w:t xml:space="preserve">המסגרת התאורטית המקובלת להסבר הקשר בין צפייה באחרים לבין הערכת הגוף היא תאוריית ההשוואה החברתית, שלפיה אנשים מעריכים את עצמם באמצעות השוואות לדעותיהם וליכולותיהם של אחרים (Festinger, 1954, כפי שמצוטט אצל פולישוק וזיסברג, 2016). ברשתות חברתיות ההשוואה מודגשת וחזקה יותר מאשר באינטראקציות פנים אל פנים: התוכן חזותי ברובו, תמונות עוברות בחירה וסינון קפדניים לפני פרסומן, ותמונות מקצועיות עוברות מניפולציה דיגיטלית היוצרת סטנדרט יופי שאינו בר השגה במציאות. ההשוואות התכופות והחשיפה בעלת האופי השיפוטי עלולות להביא לחוסר שביעות רצון מהמראה החיצוני (פולישוק וזיסברג, 2016).</w:t>
       </w:r>
     </w:p>
@@ -954,7 +971,7 @@
           <w:szCs w:val="24"/>
           <w:rtl/>
         </w:rPr>
-        <w:t xml:space="preserve">ראוי שדרכי ההתמודדות לא יתבססו על הרחקה גורפת מהרשתות. המדיה הדיגיטליים תורמים גם לרווחה, ללמידה ולקשר חברתי, והרשת משמשת לצעירים מרחב של יצירתיות והבניית זהות. התמודדות מאוזנת תכיר בתפקיד החיובי הזה ותכוון לשימוש מודע ומיטיב, ולא לאיסור (אליאס, 2022; יאיר, 2025).</w:t>
+        <w:t xml:space="preserve">ראוי שדרכי ההתמודדות לא יתבססו על הרחקה גורפת מהרשתות. המדיה הדיגיטליים תורמים גם לרווחה, ללמידה ולקשר חברתי, והם חלק בלתי נפרד מחיי החברה של צעירים. התמודדות מאוזנת תכיר בתפקיד החיובי הזה ותכוון לשימוש מודע ומיטיב, ולא לאיסור (אליאס, 2022).</w:t>
       </w:r>
     </w:p>
     <w:p>
@@ -1100,7 +1117,7 @@
           <w:szCs w:val="24"/>
           <w:rtl/>
         </w:rPr>
-        <w:t xml:space="preserve">יאיר, ת' (2025). הומור, אירוניה ומשחקיות בשפת בני נוער בווטסאפ. </w:t>
+        <w:t xml:space="preserve">לצר, י' (2016). ראי ראי, היש יפה ממני? תפקיד המדיה בהתפתחות הפרעות אכילה. </w:t>
       </w:r>
       <w:r>
         <w:rPr>
@@ -1111,16 +1128,24 @@
           <w:szCs w:val="24"/>
           <w:rtl/>
         </w:rPr>
-        <w:t xml:space="preserve">הומור מקוון: כתב עת מדעי לחקר ההומור, 24</w:t>
-      </w:r>
-      <w:r>
-        <w:rPr>
-          <w:rFonts w:ascii="David" w:cs="David" w:eastAsia="David" w:hAnsi="David"/>
-          <w:sz w:val="24"/>
-          <w:szCs w:val="24"/>
-          <w:rtl/>
-        </w:rPr>
-        <w:t xml:space="preserve">.</w:t>
+        <w:t xml:space="preserve">דברים, 9</w:t>
+      </w:r>
+      <w:r>
+        <w:rPr>
+          <w:rFonts w:ascii="David" w:cs="David" w:eastAsia="David" w:hAnsi="David"/>
+          <w:sz w:val="24"/>
+          <w:szCs w:val="24"/>
+          <w:rtl/>
+        </w:rPr>
+        <w:t xml:space="preserve">, 115-132. </w:t>
+      </w:r>
+      <w:r>
+        <w:rPr>
+          <w:rFonts w:ascii="Times New Roman" w:cs="Times New Roman" w:eastAsia="Times New Roman" w:hAnsi="Times New Roman"/>
+          <w:sz w:val="24"/>
+          <w:szCs w:val="24"/>
+        </w:rPr>
+        <w:t xml:space="preserve">https://dvarim.oranim.ac.il/wp-content/uploads/2017/01/יעל-לצר.pdf</w:t>
       </w:r>
     </w:p>
     <w:p>

</xml_diff>

<commit_message>
Strengthen chapters with verified findings from full Latzer article text
Co-Authored-By: Claude Fable 5 <noreply@anthropic.com>
Claude-Session: https://claude.ai/code/session_01XMxbVW1mQoeJZiQuhYdABE
</commit_message>
<xml_diff>
--- a/הקשר בין חשיפה לרשתות חברתיות לבין דימוי גוף - עבודה מסכמת.docx
+++ b/הקשר בין חשיפה לרשתות חברתיות לבין דימוי גוף - עבודה מסכמת.docx
@@ -646,7 +646,7 @@
           <w:szCs w:val="24"/>
           <w:rtl/>
         </w:rPr>
-        <w:t xml:space="preserve">המסגרת התאורטית המקובלת להסבר הקשר בין צפייה באחרים לבין הערכת הגוף היא תאוריית ההשוואה החברתית, שלפיה אנשים מעריכים את עצמם באמצעות השוואות לדעותיהם וליכולותיהם של אחרים (Festinger, 1954, כפי שמצוטט אצל פולישוק וזיסברג, 2016). ברשתות חברתיות ההשוואה מודגשת וחזקה יותר מאשר באינטראקציות פנים אל פנים: התוכן חזותי ברובו, תמונות עוברות בחירה וסינון קפדניים לפני פרסומן, ותמונות מקצועיות עוברות מניפולציה דיגיטלית היוצרת סטנדרט יופי שאינו בר השגה במציאות. ההשוואות התכופות והחשיפה בעלת האופי השיפוטי עלולות להביא לחוסר שביעות רצון מהמראה החיצוני (פולישוק וזיסברג, 2016).</w:t>
+        <w:t xml:space="preserve">המסגרת התאורטית המקובלת להסבר הקשר בין צפייה באחרים לבין הערכת הגוף היא תאוריית ההשוואה החברתית, שלפיה אנשים מעריכים את עצמם באמצעות השוואות לדעותיהם וליכולותיהם של אחרים (Festinger, 1954, כפי שמצוטט אצל פולישוק וזיסברג, 2016). ברשתות חברתיות ההשוואה מודגשת וחזקה יותר מאשר באינטראקציות פנים אל פנים: התוכן חזותי ברובו, תמונות עוברות בחירה וסינון קפדניים לפני פרסומן, ותמונות מקצועיות עוברות מניפולציה דיגיטלית היוצרת סטנדרט יופי שאינו בר השגה במציאות. ההשוואות התכופות והחשיפה בעלת האופי השיפוטי עלולות להביא לחוסר שביעות רצון מהמראה החיצוני (פולישוק וזיסברג, 2016). עד כמה ההשוואה הזו מעוותת את התפיסה אפשר ללמוד מכך שמרבית הנשים בעולם המערבי נוטות להעריך את עצמן כבעלות משקל עודף, ללא קשר למשקלן בפועל, בעקבות השוואה למודלים מופנמים שאינם ניתנים למימוש (לצר, 2016).</w:t>
       </w:r>
     </w:p>
     <w:p>
@@ -834,7 +834,7 @@
           <w:szCs w:val="24"/>
           <w:rtl/>
         </w:rPr>
-        <w:t xml:space="preserve">קריאה משולבת של שלושת המחקרים מלמדת יותר מכל אחד מהם בנפרד. בנקודה אחת הם מחזקים זה את זה: שלושתם מצביעים על כך שהמנגנון הפעיל הוא ההשוואה לאחרים, ולא החשיפה כשלעצמה. בספרד הקשר תווך על ידי נטיית ההשוואה, בגרמניה רק גלישה בתכני זרים ניבאה פגיעה, ובישראל הכריעו את התמונה ההבדלים בין אנשים במשאב רגשי פנימי. ההבדלים בין המחקרים חשובים לא פחות: הם נבדלים בפלטפורמה הנבדקת, במדדים ובכיוון הממצאים, והממצא הישראלי ההפוך מזכיר שהקשר אינו דטרמיניסטי ואינו אחיד בכל מדגם. מגבלה משותפת לשלושתם היא היותם מחקרים מתאמיים המבוססים על דיווח עצמי, ולכן איש מהם אינו יכול לקבוע מה קודם למה: החשיפה לדימוי הגוף או דימוי הגוף לחשיפה (פולישוק וזיסברג, 2016; </w:t>
+        <w:t xml:space="preserve">קריאה משולבת של שלושת המחקרים מלמדת יותר מכל אחד מהם בנפרד. בנקודה אחת הם מחזקים זה את זה: שלושתם מצביעים על כך שהמנגנון הפעיל הוא ההשוואה לאחרים, ולא החשיפה כשלעצמה. בספרד הקשר תווך על ידי נטיית ההשוואה, בגרמניה רק גלישה בתכני זרים ניבאה פגיעה, ובישראל הכריעו את התמונה ההבדלים בין אנשים במשאב רגשי פנימי. גם הספרות הקלינית מדווחת שככל שעלה השימוש בפייסבוק, עלתה רמת הפתולוגיה הקשורה באכילה, ובכלל זה דחף לרזון, נטייה לבולימיה ודימוי גוף שלילי (לצר, 2016). ההבדלים בין המחקרים חשובים לא פחות: הם נבדלים בפלטפורמה הנבדקת, במדדים ובכיוון הממצאים, והממצא הישראלי ההפוך מזכיר שהקשר אינו דטרמיניסטי ואינו אחיד בכל מדגם. מגבלה משותפת לשלושתם היא היותם מחקרים מתאמיים המבוססים על דיווח עצמי, ולכן איש מהם אינו יכול לקבוע מה קודם למה: החשיפה לדימוי הגוף או דימוי הגוף לחשיפה (פולישוק וזיסברג, 2016; </w:t>
       </w:r>
       <w:r>
         <w:rPr>
@@ -954,7 +954,7 @@
           <w:szCs w:val="24"/>
           <w:rtl/>
         </w:rPr>
-        <w:t xml:space="preserve">. קריאה זו משתלבת בגישה רחבה יותר של אוריינות דיגיטלית: הקניית כלים להורים ולילדים להבין את הסביבה המקוונת, לזהות את סיכוניה ולמצוא איזון בין החיים המקוונים לאלה שמחוץ לרשת (אליאס, 2022).</w:t>
+        <w:t xml:space="preserve">. קריאה זו משתלבת בגישה רחבה יותר של אוריינות דיגיטלית: הקניית כלים להורים ולילדים להבין את הסביבה המקוונת, לזהות את סיכוניה ולמצוא איזון בין החיים המקוונים לאלה שמחוץ לרשת (אליאס, 2022). מאמצי מניעה כאלה ראוי שיכוונו קודם כול לצעירות פגיעות, שכן חשיפה חוזרת למסרי הרזון פוגעת בעיקר במי שהערכתן העצמית ירודה מלכתחילה (לצר, 2016).</w:t>
       </w:r>
     </w:p>
     <w:p>

</xml_diff>

<commit_message>
Expand abstract, intro and summary within section 8 page limits
Co-Authored-By: Claude Fable 5 <noreply@anthropic.com>
Claude-Session: https://claude.ai/code/session_01XMxbVW1mQoeJZiQuhYdABE
</commit_message>
<xml_diff>
--- a/הקשר בין חשיפה לרשתות חברתיות לבין דימוי גוף - עבודה מסכמת.docx
+++ b/הקשר בין חשיפה לרשתות חברתיות לבין דימוי גוף - עבודה מסכמת.docx
@@ -242,7 +242,7 @@
           <w:szCs w:val="24"/>
           <w:rtl/>
         </w:rPr>
-        <w:t xml:space="preserve">עבודה זו בוחנת את הקשר שבין חשיפה לרשתות חברתיות לבין דימוי גוף בקרב בוגרים צעירים. הרשתות החברתיות הן חלק משגרת יומם של צעירים בישראל ובעולם, והתכנים המרכזיים בהן הם תמונות: תמונות של חברים ושל המשתמש עצמו, הזוכות לדירוג מיידי בלייקים ובתגובות. מצב זה מעורר את השאלה כיצד קשורה החשיפה המתמדת לתכנים חזותיים אלה לאופן שבו צעירים תופסים את גופם, דווקא בתקופת חיים שבה המראה החיצוני נקשר לזוגיות, לתעסוקה ולערך העצמי. סוגיה זו מעסיקה חוקרים, אנשי חינוך והורים כאחד, שכן דור שלם מנהל חלק ניכר מחייו החברתיים מול מסך.</w:t>
+        <w:t xml:space="preserve">עבודה זו בוחנת את הקשר שבין חשיפה לרשתות חברתיות לבין דימוי גוף בקרב בוגרים צעירים. הרשתות החברתיות הן חלק משגרת יומם של צעירים בישראל ובעולם, והתכנים המרכזיים בהן הם תמונות: תמונות של חברים ושל המשתמש עצמו, הזוכות לדירוג מיידי בלייקים ובתגובות. מצב זה מעורר את השאלה כיצד קשורה החשיפה המתמדת לתכנים חזותיים אלה לאופן שבו צעירים תופסים את גופם, דווקא בתקופת חיים שבה המראה החיצוני נקשר לזוגיות, לתעסוקה ולערך העצמי. סוגיה זו מעסיקה חוקרים, אנשי חינוך והורים כאחד, שכן דור שלם מנהל חלק ניכר מחייו החברתיים מול מסך. לשאלה יש גם משקל קליני: הספרות מתארת עלייה מתמשכת בשכיחות הפרעות האכילה בעולם המערבי ובישראל, ורואה במסרי אידיאל הרזון שמפיצה המדיה אחד הגורמים לכך (לצר, 2016).</w:t>
       </w:r>
     </w:p>
     <w:p>
@@ -310,7 +310,7 @@
           <w:szCs w:val="24"/>
           <w:rtl/>
         </w:rPr>
-        <w:t xml:space="preserve">. במדגם הישראלי נמצא, בניגוד להשערה, קשר חיובי מתון בין חשיפה לתמונות בפייסבוק לבין דימוי גוף, והקשר נעלם כאשר נכללה במודל אינטליגנציה רגשית (פולישוק וזיסברג, 2016).</w:t>
+        <w:t xml:space="preserve">. במדגם הישראלי נמצא, בניגוד להשערה, קשר חיובי מתון בין חשיפה לתמונות בפייסבוק לבין דימוי גוף, והקשר נעלם כאשר נכללה במודל אינטליגנציה רגשית (פולישוק וזיסברג, 2016). שלושת המחקרים מתאמיים, ולכן אינם מאפשרים לקבוע את כיוון הקשר.</w:t>
       </w:r>
     </w:p>
     <w:p>
@@ -401,7 +401,7 @@
           <w:szCs w:val="24"/>
           <w:rtl/>
         </w:rPr>
-        <w:t xml:space="preserve">.</w:t>
+        <w:t xml:space="preserve">. לשאלה זו גם חשיבות מעשית: הפרעות אכילה נמצאות במגמת עלייה בעולם המערבי ובישראל, והן פוגעות בעיקר בנערות ובנשים צעירות בתקופה מכרעת בהתפתחותן, כאשר דימוי גוף שלילי נחשב אחד מגורמי הסיכון המרכזיים להתפתחותן (לצר, 2016).</w:t>
       </w:r>
     </w:p>
     <w:p>
@@ -1040,7 +1040,7 @@
           <w:szCs w:val="24"/>
           <w:rtl/>
         </w:rPr>
-        <w:t xml:space="preserve">מן הממצאים נגזרות המלצות מעשיות: לשלב בתוכניות חינוך למכינות ולמוסדות אקדמיים תוכני אוריינות דיגיטלית העוסקים במפורש בדימוי גוף ובאופי הערוך של התמונות ברשת; לטפח מיומנויות של זיהוי וויסות רגשות כחלק מהכשרת צעירים; ולהדריך שימוש מודע ברשתות, המעדיף אינטראקציה עם מכרים על פני גלישה בתכני זרים. מחקר המשך ראוי שיהיה מחקר אורך, שיוכל לבחון את כיוון הקשר לאורך זמן ולבדוק את יעילותן של דרכי ההתערבות.</w:t>
+        <w:t xml:space="preserve">מן הממצאים נגזרות המלצות מעשיות: לשלב בתוכניות חינוך למכינות ולמוסדות אקדמיים תוכני אוריינות דיגיטלית העוסקים במפורש בדימוי גוף ובאופי הערוך של התמונות ברשת; לטפח מיומנויות של זיהוי וויסות רגשות כחלק מהכשרת צעירים; ולהדריך שימוש מודע ברשתות, המעדיף אינטראקציה עם מכרים על פני גלישה בתכני זרים. מחקר המשך ראוי שיהיה מחקר אורך, שיוכל לבחון את כיוון הקשר לאורך זמן ולבדוק את יעילותן של דרכי ההתערבות. חשיבותן של המלצות אלה מתחדדת לנוכח העלייה בשכיחות הפרעות האכילה, שדימוי גוף שלילי הוא גורם סיכון מרכזי להתפתחותן, ולנוכח מרכזיותן של הרשתות בחיי הצעירים.</w:t>
       </w:r>
     </w:p>
     <w:p>

</xml_diff>

<commit_message>
Add article links to bibliography entries per course guidelines
Co-Authored-By: Claude Fable 5 <noreply@anthropic.com>
Claude-Session: https://claude.ai/code/session_01XMxbVW1mQoeJZiQuhYdABE
</commit_message>
<xml_diff>
--- a/הקשר בין חשיפה לרשתות חברתיות לבין דימוי גוף - עבודה מסכמת.docx
+++ b/הקשר בין חשיפה לרשתות חברתיות לבין דימוי גוף - עבודה מסכמת.docx
@@ -1100,7 +1100,15 @@
           <w:szCs w:val="24"/>
           <w:rtl/>
         </w:rPr>
-        <w:t xml:space="preserve">(55), 11-17.</w:t>
+        <w:t xml:space="preserve">(55), 11-17. </w:t>
+      </w:r>
+      <w:r>
+        <w:rPr>
+          <w:rFonts w:ascii="Times New Roman" w:cs="Times New Roman" w:eastAsia="Times New Roman" w:hAnsi="Times New Roman"/>
+          <w:sz w:val="20"/>
+          <w:szCs w:val="20"/>
+        </w:rPr>
+        <w:t xml:space="preserve">https://www.efshar.org.il/wp-content/uploads/00Mifgash-55-%D7%92%D7%99%D7%9C%D7%99%D7%95%D7%9F-%D7%A9%D7%9C%D7%9D-1.pdf</w:t>
       </w:r>
     </w:p>
     <w:p>
@@ -1142,10 +1150,10 @@
       <w:r>
         <w:rPr>
           <w:rFonts w:ascii="Times New Roman" w:cs="Times New Roman" w:eastAsia="Times New Roman" w:hAnsi="Times New Roman"/>
-          <w:sz w:val="24"/>
-          <w:szCs w:val="24"/>
-        </w:rPr>
-        <w:t xml:space="preserve">https://dvarim.oranim.ac.il/wp-content/uploads/2017/01/יעל-לצר.pdf</w:t>
+          <w:sz w:val="20"/>
+          <w:szCs w:val="20"/>
+        </w:rPr>
+        <w:t xml:space="preserve">https://dvarim.oranim.ac.il/wp-content/uploads/2017/01/%D7%99%D7%A2%D7%9C-%D7%9C%D7%A6%D7%A8.pdf</w:t>
       </w:r>
     </w:p>
     <w:p>
@@ -1182,7 +1190,15 @@
           <w:szCs w:val="24"/>
           <w:rtl/>
         </w:rPr>
-        <w:t xml:space="preserve">(15), 297-322.</w:t>
+        <w:t xml:space="preserve">(15), 297-322. </w:t>
+      </w:r>
+      <w:r>
+        <w:rPr>
+          <w:rFonts w:ascii="Times New Roman" w:cs="Times New Roman" w:eastAsia="Times New Roman" w:hAnsi="Times New Roman"/>
+          <w:sz w:val="20"/>
+          <w:szCs w:val="20"/>
+        </w:rPr>
+        <w:t xml:space="preserve">https://academagic.co.il/article/%D7%90%D7%99%D7%A0%D7%98%D7%9C%D7%99%D7%92%D7%A0%D7%A6%D7%99%D7%94-%D7%A8%D7%92%D7%A9%D7%99%D7%AA-%D7%95%D7%93%D7%99%D7%9E%D7%95%D7%99%D7%99-%D7%92%D7%95%D7%A3-%D7%94%D7%A6%D7%A6%D7%94-%D7%9C%D7%A2/</w:t>
       </w:r>
     </w:p>
     <w:p>

</xml_diff>

<commit_message>
Remove first-line paragraph indent so first lines align flush
Co-Authored-By: Claude Fable 5 <noreply@anthropic.com>
Claude-Session: https://claude.ai/code/session_01XMxbVW1mQoeJZiQuhYdABE
</commit_message>
<xml_diff>
--- a/הקשר בין חשיפה לרשתות חברתיות לבין דימוי גוף - עבודה מסכמת.docx
+++ b/הקשר בין חשיפה לרשתות חברתיות לבין דימוי גוף - עבודה מסכמת.docx
@@ -232,7 +232,6 @@
       <w:pPr>
         <w:bidi/>
         <w:spacing w:after="0" w:line="360"/>
-        <w:ind w:firstLine="709"/>
         <w:jc w:val="both"/>
       </w:pPr>
       <w:r>
@@ -249,7 +248,6 @@
       <w:pPr>
         <w:bidi/>
         <w:spacing w:after="0" w:line="360"/>
-        <w:ind w:firstLine="709"/>
         <w:jc w:val="both"/>
       </w:pPr>
       <w:r>
@@ -266,7 +264,6 @@
       <w:pPr>
         <w:bidi/>
         <w:spacing w:after="0" w:line="360"/>
-        <w:ind w:firstLine="709"/>
         <w:jc w:val="both"/>
       </w:pPr>
       <w:r>
@@ -317,7 +314,6 @@
       <w:pPr>
         <w:bidi/>
         <w:spacing w:after="0" w:line="360"/>
-        <w:ind w:firstLine="709"/>
         <w:jc w:val="both"/>
       </w:pPr>
       <w:r>
@@ -357,7 +353,6 @@
       <w:pPr>
         <w:bidi/>
         <w:spacing w:after="0" w:line="360"/>
-        <w:ind w:firstLine="709"/>
         <w:jc w:val="both"/>
       </w:pPr>
       <w:r>
@@ -374,7 +369,6 @@
       <w:pPr>
         <w:bidi/>
         <w:spacing w:after="0" w:line="360"/>
-        <w:ind w:firstLine="709"/>
         <w:jc w:val="both"/>
       </w:pPr>
       <w:r>
@@ -408,7 +402,6 @@
       <w:pPr>
         <w:bidi/>
         <w:spacing w:after="0" w:line="360"/>
-        <w:ind w:firstLine="709"/>
         <w:jc w:val="both"/>
       </w:pPr>
       <w:r>
@@ -459,7 +452,6 @@
       <w:pPr>
         <w:bidi/>
         <w:spacing w:after="0" w:line="360"/>
-        <w:ind w:firstLine="709"/>
         <w:jc w:val="both"/>
       </w:pPr>
       <w:r>
@@ -499,7 +491,6 @@
       <w:pPr>
         <w:bidi/>
         <w:spacing w:after="0" w:line="360"/>
-        <w:ind w:firstLine="709"/>
         <w:jc w:val="both"/>
       </w:pPr>
       <w:r>
@@ -516,7 +507,6 @@
       <w:pPr>
         <w:bidi/>
         <w:spacing w:after="0" w:line="360"/>
-        <w:ind w:firstLine="709"/>
         <w:jc w:val="both"/>
       </w:pPr>
       <w:r>
@@ -533,7 +523,6 @@
       <w:pPr>
         <w:bidi/>
         <w:spacing w:after="0" w:line="360"/>
-        <w:ind w:firstLine="709"/>
         <w:jc w:val="both"/>
       </w:pPr>
       <w:r>
@@ -550,7 +539,6 @@
       <w:pPr>
         <w:bidi/>
         <w:spacing w:after="0" w:line="360"/>
-        <w:ind w:firstLine="709"/>
         <w:jc w:val="both"/>
       </w:pPr>
       <w:r>
@@ -567,7 +555,6 @@
       <w:pPr>
         <w:bidi/>
         <w:spacing w:after="0" w:line="360"/>
-        <w:ind w:firstLine="709"/>
         <w:jc w:val="both"/>
       </w:pPr>
       <w:r>
@@ -602,7 +589,6 @@
       <w:pPr>
         <w:bidi/>
         <w:spacing w:after="0" w:line="360"/>
-        <w:ind w:firstLine="709"/>
         <w:jc w:val="both"/>
       </w:pPr>
       <w:r>
@@ -619,7 +605,6 @@
       <w:pPr>
         <w:bidi/>
         <w:spacing w:after="0" w:line="360"/>
-        <w:ind w:firstLine="709"/>
         <w:jc w:val="both"/>
       </w:pPr>
       <w:r>
@@ -636,7 +621,6 @@
       <w:pPr>
         <w:bidi/>
         <w:spacing w:after="0" w:line="360"/>
-        <w:ind w:firstLine="709"/>
         <w:jc w:val="both"/>
       </w:pPr>
       <w:r>
@@ -653,7 +637,6 @@
       <w:pPr>
         <w:bidi/>
         <w:spacing w:after="0" w:line="360"/>
-        <w:ind w:firstLine="709"/>
         <w:jc w:val="both"/>
       </w:pPr>
       <w:r>
@@ -687,7 +670,6 @@
       <w:pPr>
         <w:bidi/>
         <w:spacing w:after="0" w:line="360"/>
-        <w:ind w:firstLine="709"/>
         <w:jc w:val="both"/>
       </w:pPr>
       <w:r>
@@ -739,7 +721,6 @@
       <w:pPr>
         <w:bidi/>
         <w:spacing w:after="0" w:line="360"/>
-        <w:ind w:firstLine="709"/>
         <w:jc w:val="both"/>
       </w:pPr>
       <w:r>
@@ -773,7 +754,6 @@
       <w:pPr>
         <w:bidi/>
         <w:spacing w:after="0" w:line="360"/>
-        <w:ind w:firstLine="709"/>
         <w:jc w:val="both"/>
       </w:pPr>
       <w:r>
@@ -807,7 +787,6 @@
       <w:pPr>
         <w:bidi/>
         <w:spacing w:after="0" w:line="360"/>
-        <w:ind w:firstLine="709"/>
         <w:jc w:val="both"/>
       </w:pPr>
       <w:r>
@@ -824,7 +803,6 @@
       <w:pPr>
         <w:bidi/>
         <w:spacing w:after="0" w:line="360"/>
-        <w:ind w:firstLine="709"/>
         <w:jc w:val="both"/>
       </w:pPr>
       <w:r>
@@ -876,7 +854,6 @@
       <w:pPr>
         <w:bidi/>
         <w:spacing w:after="0" w:line="360"/>
-        <w:ind w:firstLine="709"/>
         <w:jc w:val="both"/>
       </w:pPr>
       <w:r>
@@ -893,7 +870,6 @@
       <w:pPr>
         <w:bidi/>
         <w:spacing w:after="0" w:line="360"/>
-        <w:ind w:firstLine="709"/>
         <w:jc w:val="both"/>
       </w:pPr>
       <w:r>
@@ -927,7 +903,6 @@
       <w:pPr>
         <w:bidi/>
         <w:spacing w:after="0" w:line="360"/>
-        <w:ind w:firstLine="709"/>
         <w:jc w:val="both"/>
       </w:pPr>
       <w:r>
@@ -961,7 +936,6 @@
       <w:pPr>
         <w:bidi/>
         <w:spacing w:after="0" w:line="360"/>
-        <w:ind w:firstLine="709"/>
         <w:jc w:val="both"/>
       </w:pPr>
       <w:r>
@@ -996,7 +970,6 @@
       <w:pPr>
         <w:bidi/>
         <w:spacing w:after="0" w:line="360"/>
-        <w:ind w:firstLine="709"/>
         <w:jc w:val="both"/>
       </w:pPr>
       <w:r>
@@ -1030,7 +1003,6 @@
       <w:pPr>
         <w:bidi/>
         <w:spacing w:after="0" w:line="360"/>
-        <w:ind w:firstLine="709"/>
         <w:jc w:val="both"/>
       </w:pPr>
       <w:r>

</xml_diff>